<commit_message>
docs: ZH manuscript synced to v1.0-rev (full mirror of revision round 1); both docx regenerated with final figures
</commit_message>
<xml_diff>
--- a/reports/manuscript_joms_v0.9_zh.docx
+++ b/reports/manuscript_joms_v0.9_zh.docx
@@ -24,14 +24,14 @@
           <w:b/>
           <w:bCs/>
         </w:rPr>
-        <w:t xml:space="preserve">中文版初稿（Journal</w:t>
+        <w:t xml:space="preserve">中文版初稿</w:t>
       </w:r>
       <w:r>
         <w:rPr>
           <w:b/>
           <w:bCs/>
         </w:rPr>
-        <w:t xml:space="preserve"> of Medical Systems — Research </w:t>
+        <w:t xml:space="preserve"> </w:t>
       </w:r>
       <w:r>
         <w:rPr>
@@ -39,14 +39,14 @@
           <w:b/>
           <w:bCs/>
         </w:rPr>
-        <w:t xml:space="preserve">article；与英文版</w:t>
+        <w:t xml:space="preserve">v1.0-rev（Journal</w:t>
       </w:r>
       <w:r>
         <w:rPr>
           <w:b/>
           <w:bCs/>
         </w:rPr>
-        <w:t xml:space="preserve"> manuscript_joms_v0.9.md </w:t>
+        <w:t xml:space="preserve"> of Medical Systems — Research </w:t>
       </w:r>
       <w:r>
         <w:rPr>
@@ -54,137 +54,110 @@
           <w:b/>
           <w:bCs/>
         </w:rPr>
-        <w:t xml:space="preserve">对应，仅供作者与内部审稿使用；投稿以英文版为准）</w:t>
-      </w:r>
-      <w:r>
-        <w:t xml:space="preserve"> </w:t>
-      </w:r>
-      <w:r>
-        <w:rPr>
-          <w:rFonts w:hint="eastAsia"/>
-        </w:rPr>
-        <w:t xml:space="preserve">初稿</w:t>
-      </w:r>
-      <w:r>
-        <w:t xml:space="preserve"> v0.9-JOMS-zh </w:t>
-      </w:r>
-      <w:r>
-        <w:rPr>
-          <w:rFonts w:hint="eastAsia"/>
-        </w:rPr>
-        <w:t xml:space="preserve">｜</w:t>
-      </w:r>
-      <w:r>
-        <w:t xml:space="preserve"> 2026-09-27 </w:t>
-      </w:r>
-      <w:r>
-        <w:rPr>
-          <w:rFonts w:hint="eastAsia"/>
-        </w:rPr>
-        <w:t xml:space="preserve">｜</w:t>
-      </w:r>
-      <w:r>
-        <w:t xml:space="preserve"> </w:t>
-      </w:r>
-      <w:r>
-        <w:rPr>
-          <w:rFonts w:hint="eastAsia"/>
-        </w:rPr>
-        <w:t xml:space="preserve">数字来源：冻结标签</w:t>
-      </w:r>
-      <w:r>
-        <w:t xml:space="preserve"> </w:t>
-      </w:r>
-      <w:r>
-        <w:rPr>
-          <w:rStyle w:val="VerbatimChar"/>
-        </w:rPr>
-        <w:t xml:space="preserve">results-frozen-v1</w:t>
-      </w:r>
-    </w:p>
-    <w:p>
-      <w:pPr>
-        <w:pStyle w:val="BlockText"/>
-      </w:pPr>
-      <w:r>
-        <w:rPr>
-          <w:rFonts w:hint="eastAsia"/>
+        <w:t xml:space="preserve">article；与英文版</w:t>
+      </w:r>
+      <w:r>
+        <w:rPr>
           <w:b/>
           <w:bCs/>
         </w:rPr>
-        <w:t xml:space="preserve">标题页（提交前由作者补全）</w:t>
-      </w:r>
-      <w:r>
-        <w:t xml:space="preserve"> </w:t>
-      </w:r>
-      <w:r>
-        <w:rPr>
-          <w:rFonts w:hint="eastAsia"/>
-        </w:rPr>
-        <w:t xml:space="preserve">作者：Taylor</w:t>
-      </w:r>
-      <w:r>
-        <w:t xml:space="preserve"> </w:t>
-      </w:r>
-      <w:r>
-        <w:rPr>
-          <w:rFonts w:hint="eastAsia"/>
-        </w:rPr>
-        <w:t xml:space="preserve">[姓名]；单位：[院系，机构，城市，国家]；ORCID：[待填]；通信邮箱：[待填]</w:t>
-      </w:r>
-      <w:r>
-        <w:t xml:space="preserve"> </w:t>
-      </w:r>
-      <w:r>
-        <w:rPr>
+        <w:t xml:space="preserve"> manuscript_joms_v0.9.md v1.0-rev </w:t>
+      </w:r>
+      <w:r>
+        <w:rPr>
+          <w:rFonts w:hint="eastAsia"/>
           <w:b/>
           <w:bCs/>
         </w:rPr>
-        <w:t xml:space="preserve">LLM </w:t>
-      </w:r>
+        <w:t xml:space="preserve">全量同步，仅供作者与内部审稿使用；投稿以英文版为准）</w:t>
+      </w:r>
+      <w:r>
+        <w:t xml:space="preserve"> </w:t>
+      </w:r>
+      <w:r>
+        <w:t xml:space="preserve">2026-09-27 </w:t>
+      </w:r>
+      <w:r>
+        <w:rPr>
+          <w:rFonts w:hint="eastAsia"/>
+        </w:rPr>
+        <w:t xml:space="preserve">｜</w:t>
+      </w:r>
+      <w:r>
+        <w:t xml:space="preserve"> </w:t>
+      </w:r>
+      <w:r>
+        <w:rPr>
+          <w:rFonts w:hint="eastAsia"/>
+        </w:rPr>
+        <w:t xml:space="preserve">修订轮</w:t>
+      </w:r>
+      <w:r>
+        <w:t xml:space="preserve"> </w:t>
+      </w:r>
+      <w:r>
+        <w:rPr>
+          <w:rFonts w:hint="eastAsia"/>
+        </w:rPr>
+        <w:t xml:space="preserve">1（三位审稿人意见已应用）｜</w:t>
+      </w:r>
+      <w:r>
+        <w:t xml:space="preserve"> </w:t>
+      </w:r>
+      <w:r>
+        <w:rPr>
+          <w:rFonts w:hint="eastAsia"/>
+        </w:rPr>
+        <w:t xml:space="preserve">数字来源：冻结标签</w:t>
+      </w:r>
+      <w:r>
+        <w:t xml:space="preserve"> </w:t>
+      </w:r>
+      <w:r>
+        <w:rPr>
+          <w:rStyle w:val="VerbatimChar"/>
+        </w:rPr>
+        <w:t xml:space="preserve">results-frozen-v1</w:t>
+      </w:r>
+    </w:p>
+    <w:p>
+      <w:pPr>
+        <w:pStyle w:val="BlockText"/>
+      </w:pPr>
       <w:r>
         <w:rPr>
           <w:rFonts w:hint="eastAsia"/>
           <w:b/>
           <w:bCs/>
         </w:rPr>
-        <w:t xml:space="preserve">使用披露（期刊要求，请作者核实补全）：</w:t>
-      </w:r>
-      <w:r>
-        <w:t xml:space="preserve"> </w:t>
-      </w:r>
-      <w:r>
-        <w:rPr>
-          <w:rFonts w:hint="eastAsia"/>
-        </w:rPr>
-        <w:t xml:space="preserve">本研究的数据库管道执行、代码生成与内部一致性审计在人工指导下使用了</w:t>
-      </w:r>
-      <w:r>
-        <w:t xml:space="preserve"> AI </w:t>
-      </w:r>
-      <w:r>
-        <w:rPr>
-          <w:rFonts w:hint="eastAsia"/>
-        </w:rPr>
-        <w:t xml:space="preserve">智能体（ZCode</w:t>
-      </w:r>
-      <w:r>
-        <w:t xml:space="preserve"> </w:t>
-      </w:r>
-      <w:r>
-        <w:rPr>
-          <w:rFonts w:hint="eastAsia"/>
-        </w:rPr>
-        <w:t xml:space="preserve">CLI，GLM</w:t>
-      </w:r>
-      <w:r>
-        <w:t xml:space="preserve"> </w:t>
-      </w:r>
-      <w:r>
-        <w:rPr>
-          <w:rFonts w:hint="eastAsia"/>
-        </w:rPr>
-        <w:t xml:space="preserve">模型）；全部输出经作者核验，作者对所有内容（含引文）负责。工具/版本/日期于投稿时填写。</w:t>
+        <w:t xml:space="preserve">标题页（提交前由作者补全）</w:t>
+      </w:r>
+      <w:r>
+        <w:t xml:space="preserve"> </w:t>
+      </w:r>
+      <w:r>
+        <w:rPr>
+          <w:rFonts w:hint="eastAsia"/>
+        </w:rPr>
+        <w:t xml:space="preserve">作者：Taylor</w:t>
+      </w:r>
+      <w:r>
+        <w:t xml:space="preserve"> </w:t>
+      </w:r>
+      <w:r>
+        <w:rPr>
+          <w:rFonts w:hint="eastAsia"/>
+        </w:rPr>
+        <w:t xml:space="preserve">[姓名]；单位：[院系，机构，城市，国家]；ORCID：[待填]；通信邮箱：[待填]。CRediT</w:t>
+      </w:r>
+      <w:r>
+        <w:t xml:space="preserve"> </w:t>
+      </w:r>
+      <w:r>
+        <w:rPr>
+          <w:rFonts w:hint="eastAsia"/>
+        </w:rPr>
+        <w:t xml:space="preserve">角色：[待分配]。</w:t>
       </w:r>
     </w:p>
     <w:p>
@@ -206,74 +179,7 @@
         <w:rPr>
           <w:rFonts w:hint="eastAsia"/>
         </w:rPr>
-        <w:t xml:space="preserve">共形预测；帕金森病；打字动力学；覆盖审计；跨数据集部署；不确定性量化</w:t>
-      </w:r>
-    </w:p>
-    <w:p>
-      <w:pPr>
-        <w:pStyle w:val="BodyText"/>
-      </w:pPr>
-      <w:r>
-        <w:rPr>
-          <w:rFonts w:hint="eastAsia"/>
-          <w:b/>
-          <w:bCs/>
-        </w:rPr>
-        <w:t xml:space="preserve">报告清单：</w:t>
-      </w:r>
-      <w:r>
-        <w:t xml:space="preserve"> </w:t>
-      </w:r>
-      <w:r>
-        <w:t xml:space="preserve">TRIPOD+AI </w:t>
-      </w:r>
-      <w:r>
-        <w:rPr>
-          <w:rFonts w:hint="eastAsia"/>
-        </w:rPr>
-        <w:t xml:space="preserve">清单需填写后作为补充材料上传。分析协议在任何跨数据集覆盖数字算出之前已在</w:t>
-      </w:r>
-      <w:r>
-        <w:t xml:space="preserve"> OSF </w:t>
-      </w:r>
-      <w:r>
-        <w:rPr>
-          <w:rFonts w:hint="eastAsia"/>
-        </w:rPr>
-        <w:t xml:space="preserve">预注册（保密期</w:t>
-      </w:r>
-      <w:r>
-        <w:t xml:space="preserve"> 2 </w:t>
-      </w:r>
-      <w:r>
-        <w:rPr>
-          <w:rFonts w:hint="eastAsia"/>
-        </w:rPr>
-        <w:t xml:space="preserve">年；分析计划</w:t>
-      </w:r>
-      <w:r>
-        <w:t xml:space="preserve"> </w:t>
-      </w:r>
-      <w:r>
-        <w:rPr>
-          <w:rFonts w:hint="eastAsia"/>
-        </w:rPr>
-        <w:t xml:space="preserve">v1，冻结标签</w:t>
-      </w:r>
-      <w:r>
-        <w:t xml:space="preserve"> </w:t>
-      </w:r>
-      <w:r>
-        <w:rPr>
-          <w:rStyle w:val="VerbatimChar"/>
-        </w:rPr>
-        <w:t xml:space="preserve">v1.0-prereg</w:t>
-      </w:r>
-      <w:r>
-        <w:rPr>
-          <w:rFonts w:hint="eastAsia"/>
-        </w:rPr>
-        <w:t xml:space="preserve">）。</w:t>
+        <w:t xml:space="preserve">共形预测；帕金森病；打字动力学；覆盖审计；跨数据集部署；临床决策支持</w:t>
       </w:r>
     </w:p>
     <w:p>
@@ -303,7 +209,7 @@
         <w:rPr>
           <w:rFonts w:hint="eastAsia"/>
         </w:rPr>
-        <w:t xml:space="preserve">背景：共形预测（CP）提供分布无关的预测集合，在可交换性下保证边际覆盖率。在基于打字动力学的帕金森病（PD）检测中，跨数据集部署会降低判别力，但覆盖保证在部署偏移下的命运从未被实证审计。方法：在预注册协议下，我们审计了分类器从一个公开打字数据集训练、部署到另一个数据集时的</w:t>
+        <w:t xml:space="preserve">背景：共形预测（CP）提供分布无关的预测集合，在可交换性下保证边际覆盖率。在基于打字动力学的帕金森病（PD）检测中，跨数据集部署会降低判别力，但覆盖保证在部署偏移下的命运此前未被实证审计。方法：在预注册协议下，我们审计了分类器从一个公开打字数据集训练、部署到另一个数据集时的</w:t>
       </w:r>
       <w:r>
         <w:t xml:space="preserve"> split-CP </w:t>
@@ -321,10 +227,10 @@
         <w:rPr>
           <w:rFonts w:hint="eastAsia"/>
         </w:rPr>
-        <w:t xml:space="preserve">0.10；LAC</w:t>
-      </w:r>
-      <w:r>
-        <w:t xml:space="preserve"> </w:t>
+        <w:t xml:space="preserve">0.10；标准</w:t>
+      </w:r>
+      <w:r>
+        <w:t xml:space="preserve"> split-conformal </w:t>
       </w:r>
       <w:r>
         <w:rPr>
@@ -357,7 +263,30 @@
         <w:rPr>
           <w:rFonts w:hint="eastAsia"/>
         </w:rPr>
-        <w:t xml:space="preserve">类条件覆盖为预先设定的安全性诊断。恢复（目标域校准预算）与归因（患病率重采样与标签翻转应力测试，对照预设实用容差）为预注册的次要分析。结果：三个主方向全部不相容（家族受控）：Tappy→MIT</w:t>
+        <w:t xml:space="preserve">类条件覆盖为预先设定的安全性诊断。恢复（目标域校准预算）与归因（患病率重采样与标签翻转应力测试，对照预设实用容差）为预注册的次要分析。结果：三个主方向全部</w:t>
+      </w:r>
+      <w:r>
+        <w:rPr>
+          <w:rFonts w:hint="eastAsia"/>
+          <w:b/>
+          <w:bCs/>
+        </w:rPr>
+        <w:t xml:space="preserve">不相容</w:t>
+      </w:r>
+      <w:r>
+        <w:rPr>
+          <w:rFonts w:hint="eastAsia"/>
+        </w:rPr>
+        <w:t xml:space="preserve">——预注册审计判定，即与名义</w:t>
+      </w:r>
+      <w:r>
+        <w:t xml:space="preserve"> 0.90 </w:t>
+      </w:r>
+      <w:r>
+        <w:rPr>
+          <w:rFonts w:hint="eastAsia"/>
+        </w:rPr>
+        <w:t xml:space="preserve">水平的统计不相容，而非临床判定（家族受控）：Tappy→MIT</w:t>
       </w:r>
       <w:r>
         <w:t xml:space="preserve"> 0.598 [95% CI </w:t>
@@ -456,7 +385,16 @@
         <w:rPr>
           <w:rFonts w:hint="eastAsia"/>
         </w:rPr>
-        <w:t xml:space="preserve">个目标域标注，但</w:t>
+        <w:t xml:space="preserve">个目标域标注（5%</w:t>
+      </w:r>
+      <w:r>
+        <w:t xml:space="preserve"> </w:t>
+      </w:r>
+      <w:r>
+        <w:rPr>
+          <w:rFonts w:hint="eastAsia"/>
+        </w:rPr>
+        <w:t xml:space="preserve">档），但</w:t>
       </w:r>
       <w:r>
         <w:t xml:space="preserve"> Tappy→MIT </w:t>
@@ -465,7 +403,16 @@
         <w:rPr>
           <w:rFonts w:hint="eastAsia"/>
         </w:rPr>
-        <w:t xml:space="preserve">在</w:t>
+        <w:t xml:space="preserve">按</w:t>
+      </w:r>
+      <w:r>
+        <w:t xml:space="preserve"> CI </w:t>
+      </w:r>
+      <w:r>
+        <w:rPr>
+          <w:rFonts w:hint="eastAsia"/>
+        </w:rPr>
+        <w:t xml:space="preserve">准则在</w:t>
       </w:r>
       <w:r>
         <w:t xml:space="preserve"> 30% </w:t>
@@ -518,6 +465,9 @@
         <w:pStyle w:val="Heading2"/>
       </w:pPr>
       <w:r>
+        <w:t xml:space="preserve">1. </w:t>
+      </w:r>
+      <w:r>
         <w:rPr>
           <w:rFonts w:hint="eastAsia"/>
         </w:rPr>
@@ -532,16 +482,53 @@
         <w:rPr>
           <w:rFonts w:hint="eastAsia"/>
         </w:rPr>
-        <w:t xml:space="preserve">打字动力学为帕金森病筛查提供了可扩展的数字生物标志物，公开数据集支撑了十年以判别力为唯一评价货币的分类器研发——典型指标是跨数据集迁移下的</w:t>
-      </w:r>
-      <w:r>
-        <w:t xml:space="preserve"> </w:t>
-      </w:r>
-      <w:r>
-        <w:rPr>
-          <w:rFonts w:hint="eastAsia"/>
-        </w:rPr>
-        <w:t xml:space="preserve">AUC，其退化已被充分记录。一个已部署的筛查系统必须交付第二种性质：校准的不确定性。共形预测承诺这一点——在可交换性下，split</w:t>
+        <w:t xml:space="preserve">打字动力学</w:t>
+      </w:r>
+      <w:r>
+        <w:rPr>
+          <w:rFonts w:hint="eastAsia"/>
+          <w:b/>
+          <w:bCs/>
+        </w:rPr>
+        <w:t xml:space="preserve">被提出</w:t>
+      </w:r>
+      <w:r>
+        <w:rPr>
+          <w:rFonts w:hint="eastAsia"/>
+        </w:rPr>
+        <w:t xml:space="preserve">作为帕金森病（PD）筛查的可扩展数字生物标志物</w:t>
+      </w:r>
+      <w:r>
+        <w:rPr>
+          <w:rFonts w:hint="eastAsia"/>
+          <w:b/>
+          <w:bCs/>
+        </w:rPr>
+        <w:t xml:space="preserve">候选</w:t>
+      </w:r>
+      <w:r>
+        <w:rPr>
+          <w:rFonts w:hint="eastAsia"/>
+        </w:rPr>
+        <w:t xml:space="preserve">，公开数据集支撑了十年以判别力为几乎唯一评价货币的分类器研发——典型指标是跨数据集迁移下的</w:t>
+      </w:r>
+      <w:r>
+        <w:t xml:space="preserve"> </w:t>
+      </w:r>
+      <w:r>
+        <w:rPr>
+          <w:rFonts w:hint="eastAsia"/>
+        </w:rPr>
+        <w:t xml:space="preserve">AUC，其退化已被充分记录</w:t>
+      </w:r>
+      <w:r>
+        <w:t xml:space="preserve"> </w:t>
+      </w:r>
+      <w:r>
+        <w:rPr>
+          <w:rFonts w:hint="eastAsia"/>
+        </w:rPr>
+        <w:t xml:space="preserve">[4]。一个已部署的筛查系统必须交付第二种性质：校准的不确定性。覆盖率是系统预测集合包含真实诊断的承诺比率；覆盖失效即系统错校准——最坏的情形是系统输出一个自信的错误单例标签，而这正是分诊工作流最承受不起的情形。共形预测（CP）承诺这种校准：在可交换性下，split</w:t>
       </w:r>
       <w:r>
         <w:t xml:space="preserve"> CP </w:t>
@@ -559,7 +546,16 @@
         <w:rPr>
           <w:rFonts w:hint="eastAsia"/>
         </w:rPr>
-        <w:t xml:space="preserve">的概率覆盖真实标签，与底层模型无关——但跨数据集部署破坏了可交换性，且现实临床数据偏移下</w:t>
+        <w:t xml:space="preserve">的概率覆盖真实标签，与底层模型无关</w:t>
+      </w:r>
+      <w:r>
+        <w:t xml:space="preserve"> </w:t>
+      </w:r>
+      <w:r>
+        <w:rPr>
+          <w:rFonts w:hint="eastAsia"/>
+        </w:rPr>
+        <w:t xml:space="preserve">[5,6]。跨数据集部署破坏可交换性，且现实临床数据偏移下</w:t>
       </w:r>
       <w:r>
         <w:t xml:space="preserve"> CP </w:t>
@@ -568,7 +564,16 @@
         <w:rPr>
           <w:rFonts w:hint="eastAsia"/>
         </w:rPr>
-        <w:t xml:space="preserve">覆盖的行为研究多停留在理论或医学之外。据我们所知，这是首个对公开帕金森打字数据集上的共形预测覆盖率进行系统性实证审计的工作。</w:t>
+        <w:t xml:space="preserve">覆盖的行为研究多停留在理论或医学之外</w:t>
+      </w:r>
+      <w:r>
+        <w:t xml:space="preserve"> </w:t>
+      </w:r>
+      <w:r>
+        <w:rPr>
+          <w:rFonts w:hint="eastAsia"/>
+        </w:rPr>
+        <w:t xml:space="preserve">[7–10]。据我们所知，这是首个对公开帕金森打字数据集上的共形预测覆盖率进行系统性实证审计的工作。</w:t>
       </w:r>
     </w:p>
     <w:p>
@@ -588,7 +593,21 @@
         <w:rPr>
           <w:rFonts w:hint="eastAsia"/>
         </w:rPr>
-        <w:t xml:space="preserve">H1）。我们报告三条预注册证据表明它们确实不同：主终点家族的覆盖判定一致为负而判别力保持中等；判别力更低的对照模型展现出更高的覆盖率——覆盖失败是分数依赖的，而非任务偏移本身的属性；以形式上重现类条件崩塌的受控标签操纵，在量级上无法重现观察到的表型。我们将本工作报告为映射可靠性审计而非失败声明：预注册的判定词汇表达的是与预设运营审计阈值的统计相容性，而非临床失败，且主结果不以观察到退化为条件。</w:t>
+        <w:t xml:space="preserve">H1）。我们报告三条预注册证据表明它们确实不同：主终点家族的覆盖判定一致为负而判别力保持中等；判别力更低的对照模型展现出更高的覆盖率——覆盖失败是分数依赖的，而非任务偏移本身的属性；以形式上重现类条件崩塌的受控标签操纵，在量级上无法重现观察到的表型——患病率与噪声单独不足，指向特征空间偏移本身。本审计评估的是公开数据集上的</w:t>
+      </w:r>
+      <w:r>
+        <w:rPr>
+          <w:rFonts w:hint="eastAsia"/>
+          <w:b/>
+          <w:bCs/>
+        </w:rPr>
+        <w:t xml:space="preserve">研究级</w:t>
+      </w:r>
+      <w:r>
+        <w:rPr>
+          <w:rFonts w:hint="eastAsia"/>
+        </w:rPr>
+        <w:t xml:space="preserve">分类器；它不确立临床筛查有效性，所研究的模型也不是经临床验证的筛查设备。我们将本工作报告为映射可靠性审计而非失败声明：预注册的判定词汇表达的是与预设运营审计阈值的统计相容性，而非临床失败，且主结果不以观察到退化为条件。</w:t>
       </w:r>
     </w:p>
     <w:p>
@@ -626,7 +645,7 @@
         <w:rPr>
           <w:rFonts w:hint="eastAsia"/>
         </w:rPr>
-        <w:t xml:space="preserve">覆盖率进行预注册、保密期的系统性审计，含冻结队列与家族受控主终点；(ii)</w:t>
+        <w:t xml:space="preserve">覆盖率进行预注册、保密期的系统性审计，含冻结队列与家族受控主终点（新颖性声明仅在引言陈述一次）；(ii)</w:t>
       </w:r>
       <w:r>
         <w:t xml:space="preserve"> </w:t>
@@ -708,6 +727,9 @@
         <w:pStyle w:val="Heading2"/>
       </w:pPr>
       <w:r>
+        <w:t xml:space="preserve">2. </w:t>
+      </w:r>
+      <w:r>
         <w:rPr>
           <w:rFonts w:hint="eastAsia"/>
         </w:rPr>
@@ -720,6 +742,9 @@
         <w:pStyle w:val="Heading3"/>
       </w:pPr>
       <w:r>
+        <w:t xml:space="preserve">2.1 </w:t>
+      </w:r>
+      <w:r>
         <w:rPr>
           <w:rFonts w:hint="eastAsia"/>
         </w:rPr>
@@ -752,7 +777,7 @@
         <w:rPr>
           <w:rFonts w:hint="eastAsia"/>
         </w:rPr>
-        <w:t xml:space="preserve">English（自报，网页端）。清洗规则预注册且标签盲（七步，如会话有效</w:t>
+        <w:t xml:space="preserve">English（自报，网页端）。清洗规则预注册且标签盲（七步；会话有效</w:t>
       </w:r>
       <w:r>
         <w:t xml:space="preserve"> digraph </w:t>
@@ -761,7 +786,7 @@
         <w:rPr>
           <w:rFonts w:hint="eastAsia"/>
         </w:rPr>
-        <w:t xml:space="preserve">≥100、人资格</w:t>
+        <w:t xml:space="preserve">≥100；人资格</w:t>
       </w:r>
       <w:r>
         <w:t xml:space="preserve"> </w:t>
@@ -824,7 +849,16 @@
         <w:rPr>
           <w:rFonts w:hint="eastAsia"/>
         </w:rPr>
-        <w:t xml:space="preserve">193（83/110）。PD</w:t>
+        <w:t xml:space="preserve">193（83/110）（表</w:t>
+      </w:r>
+      <w:r>
+        <w:t xml:space="preserve"> </w:t>
+      </w:r>
+      <w:r>
+        <w:rPr>
+          <w:rFonts w:hint="eastAsia"/>
+        </w:rPr>
+        <w:t xml:space="preserve">1）。PD</w:t>
       </w:r>
       <w:r>
         <w:t xml:space="preserve"> </w:t>
@@ -851,7 +885,105 @@
         <w:rPr>
           <w:rFonts w:hint="eastAsia"/>
         </w:rPr>
-        <w:t xml:space="preserve">参与者被主分析排除；双向重纳入作为敏感性分析报告。本研究仅使用去标识化的公开数据集，未收集新的人体数据。</w:t>
+        <w:t xml:space="preserve">参与者被主分析排除；双向重纳入作为敏感性分析报告。</w:t>
+      </w:r>
+    </w:p>
+    <w:p>
+      <w:pPr>
+        <w:pStyle w:val="BodyText"/>
+      </w:pPr>
+      <w:r>
+        <w:rPr>
+          <w:rFonts w:hint="eastAsia"/>
+        </w:rPr>
+        <w:t xml:space="preserve">本研究仅使用为研究用途发布的去标识化公开数据集，未收集新的人体数据，无任何干预。我们按</w:t>
+      </w:r>
+      <w:r>
+        <w:t xml:space="preserve"> TRIPOD+AI </w:t>
+      </w:r>
+      <w:r>
+        <w:rPr>
+          <w:rFonts w:hint="eastAsia"/>
+        </w:rPr>
+        <w:t xml:space="preserve">声明</w:t>
+      </w:r>
+      <w:r>
+        <w:t xml:space="preserve"> [14] </w:t>
+      </w:r>
+      <w:r>
+        <w:rPr>
+          <w:rFonts w:hint="eastAsia"/>
+        </w:rPr>
+        <w:t xml:space="preserve">报告；填写完成的清单作为补充材料随稿提交。分析协议在任何跨数据集覆盖数字算出之前已在</w:t>
+      </w:r>
+      <w:r>
+        <w:t xml:space="preserve"> Open Science Framework </w:t>
+      </w:r>
+      <w:r>
+        <w:rPr>
+          <w:rFonts w:hint="eastAsia"/>
+        </w:rPr>
+        <w:t xml:space="preserve">预注册（保密期</w:t>
+      </w:r>
+      <w:r>
+        <w:t xml:space="preserve"> 2 </w:t>
+      </w:r>
+      <w:r>
+        <w:rPr>
+          <w:rFonts w:hint="eastAsia"/>
+        </w:rPr>
+        <w:t xml:space="preserve">年；冻结计划</w:t>
+      </w:r>
+      <w:r>
+        <w:t xml:space="preserve"> </w:t>
+      </w:r>
+      <w:r>
+        <w:rPr>
+          <w:rFonts w:hint="eastAsia"/>
+        </w:rPr>
+        <w:t xml:space="preserve">v1，标签</w:t>
+      </w:r>
+      <w:r>
+        <w:t xml:space="preserve"> </w:t>
+      </w:r>
+      <w:r>
+        <w:rPr>
+          <w:rStyle w:val="VerbatimChar"/>
+        </w:rPr>
+        <w:t xml:space="preserve">v1.0-prereg</w:t>
+      </w:r>
+      <w:r>
+        <w:rPr>
+          <w:rFonts w:hint="eastAsia"/>
+        </w:rPr>
+        <w:t xml:space="preserve">；保密期内可申请获取）。AI</w:t>
+      </w:r>
+      <w:r>
+        <w:t xml:space="preserve"> </w:t>
+      </w:r>
+      <w:r>
+        <w:rPr>
+          <w:rFonts w:hint="eastAsia"/>
+        </w:rPr>
+        <w:t xml:space="preserve">智能体（ZCode</w:t>
+      </w:r>
+      <w:r>
+        <w:t xml:space="preserve"> </w:t>
+      </w:r>
+      <w:r>
+        <w:rPr>
+          <w:rFonts w:hint="eastAsia"/>
+        </w:rPr>
+        <w:t xml:space="preserve">CLI，GLM</w:t>
+      </w:r>
+      <w:r>
+        <w:t xml:space="preserve"> </w:t>
+      </w:r>
+      <w:r>
+        <w:rPr>
+          <w:rFonts w:hint="eastAsia"/>
+        </w:rPr>
+        <w:t xml:space="preserve">模型）在人工指导下用于数据库管道执行、代码生成与内部一致性审计；作者设计研究、核验全部输出，并对包括引文在内的全部内容负责。[工具版本与使用日期于提交时补全。]</w:t>
       </w:r>
     </w:p>
     <w:bookmarkEnd w:id="11"/>
@@ -861,6 +993,9 @@
         <w:pStyle w:val="Heading3"/>
       </w:pPr>
       <w:r>
+        <w:t xml:space="preserve">2.2 </w:t>
+      </w:r>
+      <w:r>
         <w:rPr>
           <w:rFonts w:hint="eastAsia"/>
         </w:rPr>
@@ -966,6 +1101,9 @@
         <w:pStyle w:val="Heading3"/>
       </w:pPr>
       <w:r>
+        <w:t xml:space="preserve">2.3 </w:t>
+      </w:r>
+      <w:r>
         <w:rPr>
           <w:rFonts w:hint="eastAsia"/>
         </w:rPr>
@@ -1037,16 +1175,16 @@
         <w:rPr>
           <w:rFonts w:hint="eastAsia"/>
         </w:rPr>
-        <w:t xml:space="preserve">0.10、有限样本分位</w:t>
-      </w:r>
-      <w:r>
-        <w:t xml:space="preserve"> k = </w:t>
-      </w:r>
-      <w:r>
-        <w:rPr>
-          <w:rFonts w:hint="eastAsia"/>
-        </w:rPr>
-        <w:t xml:space="preserve">⌈(n+1)(1−α)⌉。四要素：预测器</w:t>
+        <w:t xml:space="preserve">0.10、水平</w:t>
+      </w:r>
+      <w:r>
+        <w:t xml:space="preserve"> ⌈(n+1)(1−α)⌉ </w:t>
+      </w:r>
+      <w:r>
+        <w:rPr>
+          <w:rFonts w:hint="eastAsia"/>
+        </w:rPr>
+        <w:t xml:space="preserve">的有限样本次序统计分位。每程序四要素——预测器</w:t>
       </w:r>
       <w:r>
         <w:t xml:space="preserve"> = </w:t>
@@ -1064,7 +1202,7 @@
         <w:rPr>
           <w:rFonts w:hint="eastAsia"/>
         </w:rPr>
-        <w:t xml:space="preserve">LAC；校准规则</w:t>
+        <w:t xml:space="preserve">LAC；校准</w:t>
       </w:r>
       <w:r>
         <w:t xml:space="preserve"> = </w:t>
@@ -1100,7 +1238,7 @@
         <w:rPr>
           <w:rFonts w:hint="eastAsia"/>
         </w:rPr>
-        <w:t xml:space="preserve">标注预算，类别分层抽取，测试用互补集）；weighted</w:t>
+        <w:t xml:space="preserve">标注预算，类别分层单次抽取，测试用互补集）；weighted</w:t>
       </w:r>
       <w:r>
         <w:t xml:space="preserve"> </w:t>
@@ -1127,6 +1265,15 @@
         <w:rPr>
           <w:rFonts w:hint="eastAsia"/>
         </w:rPr>
+        <w:t xml:space="preserve">等</w:t>
+      </w:r>
+      <w:r>
+        <w:t xml:space="preserve"> [7] </w:t>
+      </w:r>
+      <w:r>
+        <w:rPr>
+          <w:rFonts w:hint="eastAsia"/>
+        </w:rPr>
         <w:t xml:space="preserve">式(8)</w:t>
       </w:r>
       <w:r>
@@ -1136,7 +1283,7 @@
         <w:rPr>
           <w:rFonts w:hint="eastAsia"/>
         </w:rPr>
-        <w:t xml:space="preserve">直接实现，经独立</w:t>
+        <w:t xml:space="preserve">直接形式，经独立</w:t>
       </w:r>
       <w:r>
         <w:t xml:space="preserve"> oracle </w:t>
@@ -1163,7 +1310,7 @@
         <w:rPr>
           <w:rFonts w:hint="eastAsia"/>
         </w:rPr>
-        <w:t xml:space="preserve">1−α）；协议条件重校准（保证目标</w:t>
+        <w:t xml:space="preserve">1−α——注意截断使形式保证失效，故该臂作为实用干预报告）；协议条件重校准（保证目标</w:t>
       </w:r>
       <w:r>
         <w:t xml:space="preserve"> = </w:t>
@@ -1218,6 +1365,9 @@
         <w:pStyle w:val="Heading3"/>
       </w:pPr>
       <w:r>
+        <w:t xml:space="preserve">2.4 </w:t>
+      </w:r>
+      <w:r>
         <w:rPr>
           <w:rFonts w:hint="eastAsia"/>
         </w:rPr>
@@ -1268,25 +1418,50 @@
         <w:rPr>
           <w:rFonts w:hint="eastAsia"/>
         </w:rPr>
-        <w:t xml:space="preserve">0.10）。判定使用预注册词汇对照预设运营审计阈值</w:t>
-      </w:r>
-      <w:r>
-        <w:t xml:space="preserve"> </w:t>
-      </w:r>
-      <w:r>
-        <w:rPr>
-          <w:rFonts w:hint="eastAsia"/>
-        </w:rPr>
-        <w:t xml:space="preserve">0.80（相容：CI</w:t>
-      </w:r>
-      <w:r>
-        <w:t xml:space="preserve"> </w:t>
-      </w:r>
-      <w:r>
-        <w:rPr>
-          <w:rFonts w:hint="eastAsia"/>
-        </w:rPr>
-        <w:t xml:space="preserve">下界</w:t>
+        <w:t xml:space="preserve">0.10，</w:t>
+      </w:r>
+      <w:r>
+        <w:rPr>
+          <w:rFonts w:hint="eastAsia"/>
+          <w:b/>
+          <w:bCs/>
+        </w:rPr>
+        <w:t xml:space="preserve">确证性推断</w:t>
+      </w:r>
+      <w:r>
+        <w:rPr>
+          <w:rFonts w:hint="eastAsia"/>
+        </w:rPr>
+        <w:t xml:space="preserve">）。运营上，每方向还按</w:t>
+      </w:r>
+      <w:r>
+        <w:rPr>
+          <w:rFonts w:hint="eastAsia"/>
+          <w:b/>
+          <w:bCs/>
+        </w:rPr>
+        <w:t xml:space="preserve">未调整的</w:t>
+      </w:r>
+      <w:r>
+        <w:t xml:space="preserve"> </w:t>
+      </w:r>
+      <w:r>
+        <w:t xml:space="preserve">95% Clopper-Pearson </w:t>
+      </w:r>
+      <w:r>
+        <w:rPr>
+          <w:rFonts w:hint="eastAsia"/>
+        </w:rPr>
+        <w:t xml:space="preserve">区间对照预设运营审计阈值</w:t>
+      </w:r>
+      <w:r>
+        <w:t xml:space="preserve"> 0.80 </w:t>
+      </w:r>
+      <w:r>
+        <w:rPr>
+          <w:rFonts w:hint="eastAsia"/>
+        </w:rPr>
+        <w:t xml:space="preserve">获得审计标签（相容：下界</w:t>
       </w:r>
       <w:r>
         <w:t xml:space="preserve"> ≥ </w:t>
@@ -1295,16 +1470,7 @@
         <w:rPr>
           <w:rFonts w:hint="eastAsia"/>
         </w:rPr>
-        <w:t xml:space="preserve">0.80；不相容：CI</w:t>
-      </w:r>
-      <w:r>
-        <w:t xml:space="preserve"> </w:t>
-      </w:r>
-      <w:r>
-        <w:rPr>
-          <w:rFonts w:hint="eastAsia"/>
-        </w:rPr>
-        <w:t xml:space="preserve">上界</w:t>
+        <w:t xml:space="preserve">0.80；不相容：上界</w:t>
       </w:r>
       <w:r>
         <w:t xml:space="preserve"> &lt; </w:t>
@@ -1322,7 +1488,25 @@
         <w:rPr>
           <w:rFonts w:hint="eastAsia"/>
         </w:rPr>
-        <w:t xml:space="preserve">阈值无临床安全含义。PD/HC</w:t>
+        <w:t xml:space="preserve">阈值无临床安全含义。在本数据集的主方向上，两套程序结论一致；审计标签规则与预注册”Holm</w:t>
+      </w:r>
+      <w:r>
+        <w:t xml:space="preserve"> </w:t>
+      </w:r>
+      <w:r>
+        <w:rPr>
+          <w:rFonts w:hint="eastAsia"/>
+        </w:rPr>
+        <w:t xml:space="preserve">调整后</w:t>
+      </w:r>
+      <w:r>
+        <w:t xml:space="preserve"> </w:t>
+      </w:r>
+      <w:r>
+        <w:rPr>
+          <w:rFonts w:hint="eastAsia"/>
+        </w:rPr>
+        <w:t xml:space="preserve">CI”措辞的对齐已作为修正记入协议变更日志。PD/HC</w:t>
       </w:r>
       <w:r>
         <w:t xml:space="preserve"> </w:t>
@@ -1340,7 +1524,30 @@
         <w:rPr>
           <w:rFonts w:hint="eastAsia"/>
         </w:rPr>
-        <w:t xml:space="preserve">区间；在协变量与标签偏移并存时其不具备分布无关保证——这正是我们测量它的原因。</w:t>
+        <w:t xml:space="preserve">区间。</w:t>
+      </w:r>
+      <w:r>
+        <w:rPr>
+          <w:rFonts w:hint="eastAsia"/>
+          <w:b/>
+          <w:bCs/>
+        </w:rPr>
+        <w:t xml:space="preserve">即使在库内</w:t>
+      </w:r>
+      <w:r>
+        <w:rPr>
+          <w:rFonts w:hint="eastAsia"/>
+        </w:rPr>
+        <w:t xml:space="preserve">，split</w:t>
+      </w:r>
+      <w:r>
+        <w:t xml:space="preserve"> CP </w:t>
+      </w:r>
+      <w:r>
+        <w:rPr>
+          <w:rFonts w:hint="eastAsia"/>
+        </w:rPr>
+        <w:t xml:space="preserve">也只保证边际——而非类条件——覆盖；在协变量与标签偏移并存时，类条件覆盖可能在无目标标签时进一步不可识别——这正是我们测量它的原因。全部类条件、分组与对照分析均为描述性且未做校正。</w:t>
       </w:r>
     </w:p>
     <w:bookmarkEnd w:id="14"/>
@@ -1350,6 +1557,9 @@
         <w:pStyle w:val="Heading3"/>
       </w:pPr>
       <w:r>
+        <w:t xml:space="preserve">2.5 </w:t>
+      </w:r>
+      <w:r>
         <w:rPr>
           <w:rFonts w:hint="eastAsia"/>
         </w:rPr>
@@ -1418,7 +1628,21 @@
         <w:rPr>
           <w:rFonts w:hint="eastAsia"/>
         </w:rPr>
-        <w:t xml:space="preserve">三方向，与</w:t>
+        <w:t xml:space="preserve">的三个</w:t>
+      </w:r>
+      <w:r>
+        <w:rPr>
+          <w:rFonts w:hint="eastAsia"/>
+          <w:b/>
+          <w:bCs/>
+        </w:rPr>
+        <w:t xml:space="preserve">翻转方向</w:t>
+      </w:r>
+      <w:r>
+        <w:rPr>
+          <w:rFonts w:hint="eastAsia"/>
+        </w:rPr>
+        <w:t xml:space="preserve">，与</w:t>
       </w:r>
       <w:r>
         <w:t xml:space="preserve"> Einbinder </w:t>
@@ -1427,7 +1651,16 @@
         <w:rPr>
           <w:rFonts w:hint="eastAsia"/>
         </w:rPr>
-        <w:t xml:space="preserve">等的分散性噪声理论对比（精确计算校准侧随机占优条件）；(B)</w:t>
+        <w:t xml:space="preserve">等</w:t>
+      </w:r>
+      <w:r>
+        <w:t xml:space="preserve"> [9] </w:t>
+      </w:r>
+      <w:r>
+        <w:rPr>
+          <w:rFonts w:hint="eastAsia"/>
+        </w:rPr>
+        <w:t xml:space="preserve">的分散性噪声理论对比（精确计算校准侧随机占优条件）；(B)</w:t>
       </w:r>
       <w:r>
         <w:t xml:space="preserve"> </w:t>
@@ -1454,25 +1687,43 @@
         <w:rPr>
           <w:rFonts w:hint="eastAsia"/>
         </w:rPr>
-        <w:t xml:space="preserve">个百分点覆盖、±0.3</w:t>
-      </w:r>
-      <w:r>
-        <w:t xml:space="preserve"> </w:t>
-      </w:r>
-      <w:r>
-        <w:rPr>
-          <w:rFonts w:hint="eastAsia"/>
-        </w:rPr>
-        <w:t xml:space="preserve">平均集合大小）；(C)</w:t>
-      </w:r>
-      <w:r>
-        <w:t xml:space="preserve"> </w:t>
-      </w:r>
-      <w:r>
-        <w:rPr>
-          <w:rFonts w:hint="eastAsia"/>
-        </w:rPr>
-        <w:t xml:space="preserve">黑盒移位估计（BBSE）在构造性标签偏移上验证后，对真实对仅作描述性应用。按冻结措辞模板，这些检验问的是操纵是否</w:t>
+        <w:t xml:space="preserve">个百分点覆盖；±0.3</w:t>
+      </w:r>
+      <w:r>
+        <w:t xml:space="preserve"> </w:t>
+      </w:r>
+      <w:r>
+        <w:rPr>
+          <w:rFonts w:hint="eastAsia"/>
+        </w:rPr>
+        <w:t xml:space="preserve">平均集合大小，对应二分类集合大小值域的</w:t>
+      </w:r>
+      <w:r>
+        <w:t xml:space="preserve"> </w:t>
+      </w:r>
+      <w:r>
+        <w:rPr>
+          <w:rFonts w:hint="eastAsia"/>
+        </w:rPr>
+        <w:t xml:space="preserve">30%）；(C)</w:t>
+      </w:r>
+      <w:r>
+        <w:t xml:space="preserve"> </w:t>
+      </w:r>
+      <w:r>
+        <w:rPr>
+          <w:rFonts w:hint="eastAsia"/>
+        </w:rPr>
+        <w:t xml:space="preserve">黑盒移位估计（BBSE）[16]——在标签偏移假设（P(x|y)</w:t>
+      </w:r>
+      <w:r>
+        <w:t xml:space="preserve"> </w:t>
+      </w:r>
+      <w:r>
+        <w:rPr>
+          <w:rFonts w:hint="eastAsia"/>
+        </w:rPr>
+        <w:t xml:space="preserve">不变）下用源训练分类器的类条件混淆矩阵估计目标患病率——在构造性标签偏移上验证后，对真实对仅作描述性应用。按冻结措辞模板，这些检验问的是操纵是否</w:t>
       </w:r>
       <w:r>
         <w:rPr>
@@ -1497,6 +1748,9 @@
         <w:pStyle w:val="Heading2"/>
       </w:pPr>
       <w:r>
+        <w:t xml:space="preserve">3. </w:t>
+      </w:r>
+      <w:r>
         <w:rPr>
           <w:rFonts w:hint="eastAsia"/>
         </w:rPr>
@@ -1509,6 +1763,9 @@
         <w:pStyle w:val="Heading3"/>
       </w:pPr>
       <w:r>
+        <w:t xml:space="preserve">3.1 </w:t>
+      </w:r>
+      <w:r>
         <w:rPr>
           <w:rFonts w:hint="eastAsia"/>
         </w:rPr>
@@ -1613,7 +1870,16 @@
         <w:rPr>
           <w:rFonts w:hint="eastAsia"/>
         </w:rPr>
-        <w:t xml:space="preserve">0.47–0.89），缺陷反映的是自信的错误覆盖而非无信息输出。LightGBM</w:t>
+        <w:t xml:space="preserve">0.47–0.89），缺陷反映的是自信的错误覆盖而非无信息输出。单例率</w:t>
+      </w:r>
+      <w:r>
+        <w:t xml:space="preserve"> = </w:t>
+      </w:r>
+      <w:r>
+        <w:rPr>
+          <w:rFonts w:hint="eastAsia"/>
+        </w:rPr>
+        <w:t xml:space="preserve">收到单类预测集——即系统已作出承诺诊断——的受试者比例。LightGBM</w:t>
       </w:r>
       <w:r>
         <w:t xml:space="preserve"> </w:t>
@@ -1659,6 +1925,9 @@
         <w:pStyle w:val="Heading3"/>
       </w:pPr>
       <w:r>
+        <w:t xml:space="preserve">3.2 </w:t>
+      </w:r>
+      <w:r>
         <w:rPr>
           <w:rFonts w:hint="eastAsia"/>
         </w:rPr>
@@ -1757,7 +2026,7 @@
         <w:rPr>
           <w:rFonts w:hint="eastAsia"/>
         </w:rPr>
-        <w:t xml:space="preserve">名（78.6%）收到的预测集不含其真实标签——多为将其排除出疾病的自信单例。欠服务类别随目标域患病率翻转：在两个</w:t>
+        <w:t xml:space="preserve">名（78.6%）收到的预测集不含其真实标签——多为仅含非</w:t>
       </w:r>
       <w:r>
         <w:t xml:space="preserve"> PD </w:t>
@@ -1766,6 +2035,38 @@
         <w:rPr>
           <w:rFonts w:hint="eastAsia"/>
         </w:rPr>
+        <w:t xml:space="preserve">标签的自信单例，即自动通过筛查工作流下的</w:t>
+      </w:r>
+      <w:r>
+        <w:rPr>
+          <w:rFonts w:hint="eastAsia"/>
+          <w:b/>
+          <w:bCs/>
+        </w:rPr>
+        <w:t xml:space="preserve">虚假安心</w:t>
+      </w:r>
+      <w:r>
+        <w:rPr>
+          <w:rFonts w:hint="eastAsia"/>
+        </w:rPr>
+        <w:t xml:space="preserve">（图</w:t>
+      </w:r>
+      <w:r>
+        <w:t xml:space="preserve"> </w:t>
+      </w:r>
+      <w:r>
+        <w:rPr>
+          <w:rFonts w:hint="eastAsia"/>
+        </w:rPr>
+        <w:t xml:space="preserve">2）。欠服务类别随目标域患病率翻转：在两个</w:t>
+      </w:r>
+      <w:r>
+        <w:t xml:space="preserve"> PD </w:t>
+      </w:r>
+      <w:r>
+        <w:rPr>
+          <w:rFonts w:hint="eastAsia"/>
+        </w:rPr>
         <w:t xml:space="preserve">富集目标中</w:t>
       </w:r>
       <w:r>
@@ -1793,7 +2094,21 @@
         <w:rPr>
           <w:rFonts w:hint="eastAsia"/>
         </w:rPr>
-        <w:t xml:space="preserve">0.627）。对照分数在类间近乎均匀（0.925–1.000）。这些是冻结队列上的测量诊断而非保证；在协变量与标签偏移并存时，类条件覆盖可能在无目标标签时不可识别。</w:t>
+        <w:t xml:space="preserve">0.627）。对照分数在类间近乎均匀（0.925–1.000）。这些是冻结队列上</w:t>
+      </w:r>
+      <w:r>
+        <w:rPr>
+          <w:rFonts w:hint="eastAsia"/>
+          <w:b/>
+          <w:bCs/>
+        </w:rPr>
+        <w:t xml:space="preserve">未校正的测量诊断</w:t>
+      </w:r>
+      <w:r>
+        <w:rPr>
+          <w:rFonts w:hint="eastAsia"/>
+        </w:rPr>
+        <w:t xml:space="preserve">而非保证。</w:t>
       </w:r>
     </w:p>
     <w:bookmarkEnd w:id="18"/>
@@ -1803,6 +2118,9 @@
         <w:pStyle w:val="Heading3"/>
       </w:pPr>
       <w:r>
+        <w:t xml:space="preserve">3.3 </w:t>
+      </w:r>
+      <w:r>
         <w:rPr>
           <w:rFonts w:hint="eastAsia"/>
         </w:rPr>
@@ -1871,7 +2189,25 @@
         <w:rPr>
           <w:rFonts w:hint="eastAsia"/>
         </w:rPr>
-        <w:t xml:space="preserve">个方向更低；参照模型中判别力相当的方向，覆盖从</w:t>
+        <w:t xml:space="preserve">个方向更低；参照模型</w:t>
+      </w:r>
+      <w:r>
+        <w:t xml:space="preserve"> AUC </w:t>
+      </w:r>
+      <w:r>
+        <w:rPr>
+          <w:rFonts w:hint="eastAsia"/>
+        </w:rPr>
+        <w:t xml:space="preserve">跨</w:t>
+      </w:r>
+      <w:r>
+        <w:t xml:space="preserve"> 0.55–0.81 </w:t>
+      </w:r>
+      <w:r>
+        <w:rPr>
+          <w:rFonts w:hint="eastAsia"/>
+        </w:rPr>
+        <w:t xml:space="preserve">的方向，覆盖从</w:t>
       </w:r>
       <w:r>
         <w:t xml:space="preserve"> 0.58 </w:t>
@@ -1917,6 +2253,9 @@
         <w:pStyle w:val="Heading3"/>
       </w:pPr>
       <w:r>
+        <w:t xml:space="preserve">3.4 </w:t>
+      </w:r>
+      <w:r>
         <w:rPr>
           <w:rFonts w:hint="eastAsia"/>
         </w:rPr>
@@ -1988,25 +2327,25 @@
         <w:rPr>
           <w:rFonts w:hint="eastAsia"/>
         </w:rPr>
-        <w:t xml:space="preserve">不同：点估计在</w:t>
-      </w:r>
-      <w:r>
-        <w:t xml:space="preserve"> 16 </w:t>
-      </w:r>
-      <w:r>
-        <w:rPr>
-          <w:rFonts w:hint="eastAsia"/>
-        </w:rPr>
-        <w:t xml:space="preserve">个标注时越过</w:t>
-      </w:r>
-      <w:r>
-        <w:t xml:space="preserve"> </w:t>
-      </w:r>
-      <w:r>
-        <w:rPr>
-          <w:rFonts w:hint="eastAsia"/>
-        </w:rPr>
-        <w:t xml:space="preserve">0.80，但</w:t>
+        <w:t xml:space="preserve">不同：在首个非退化预算（16</w:t>
+      </w:r>
+      <w:r>
+        <w:t xml:space="preserve"> </w:t>
+      </w:r>
+      <w:r>
+        <w:rPr>
+          <w:rFonts w:hint="eastAsia"/>
+        </w:rPr>
+        <w:t xml:space="preserve">个标注）点估计越过</w:t>
+      </w:r>
+      <w:r>
+        <w:t xml:space="preserve"> </w:t>
+      </w:r>
+      <w:r>
+        <w:rPr>
+          <w:rFonts w:hint="eastAsia"/>
+        </w:rPr>
+        <w:t xml:space="preserve">0.80（0.833），但</w:t>
       </w:r>
       <w:r>
         <w:t xml:space="preserve"> CI </w:t>
@@ -2069,7 +2408,25 @@
         <w:rPr>
           <w:rFonts w:hint="eastAsia"/>
         </w:rPr>
-        <w:t xml:space="preserve">1.000）——池化重校准修复边际分位，而非类条件错校准。无标注的密度比加权实现名义覆盖（0.918–1.000）的代价是对</w:t>
+        <w:t xml:space="preserve">1.000）——池化重校准修复边际分位，而非类条件错校准。协议条件臂在双协议合并目标上评估，5%</w:t>
+      </w:r>
+      <w:r>
+        <w:t xml:space="preserve"> </w:t>
+      </w:r>
+      <w:r>
+        <w:rPr>
+          <w:rFonts w:hint="eastAsia"/>
+        </w:rPr>
+        <w:t xml:space="preserve">预算未过阈值（0.836</w:t>
+      </w:r>
+      <w:r>
+        <w:t xml:space="preserve"> [0.793, </w:t>
+      </w:r>
+      <w:r>
+        <w:rPr>
+          <w:rFonts w:hint="eastAsia"/>
+        </w:rPr>
+        <w:t xml:space="preserve">0.874]），其估计量与池化分位不同。无标注的密度比加权实现名义覆盖（0.918–1.000）的代价是对</w:t>
       </w:r>
       <w:r>
         <w:t xml:space="preserve"> 86–100% </w:t>
@@ -2106,6 +2463,9 @@
         <w:pStyle w:val="Heading3"/>
       </w:pPr>
       <w:r>
+        <w:t xml:space="preserve">3.5 </w:t>
+      </w:r>
+      <w:r>
         <w:rPr>
           <w:rFonts w:hint="eastAsia"/>
         </w:rPr>
@@ -2131,10 +2491,22 @@
         <w:t xml:space="preserve">形式</w:t>
       </w:r>
       <w:r>
-        <w:rPr>
-          <w:rFonts w:hint="eastAsia"/>
-        </w:rPr>
-        <w:t xml:space="preserve">（方向性翻转将一类钉在</w:t>
+        <w:t xml:space="preserve">——HC→PD </w:t>
+      </w:r>
+      <w:r>
+        <w:rPr>
+          <w:rFonts w:hint="eastAsia"/>
+        </w:rPr>
+        <w:t xml:space="preserve">翻转将</w:t>
+      </w:r>
+      <w:r>
+        <w:t xml:space="preserve"> PD </w:t>
+      </w:r>
+      <w:r>
+        <w:rPr>
+          <w:rFonts w:hint="eastAsia"/>
+        </w:rPr>
+        <w:t xml:space="preserve">类条件覆盖钉在</w:t>
       </w:r>
       <w:r>
         <w:t xml:space="preserve"> 1.000 </w:t>
@@ -2143,16 +2515,25 @@
         <w:rPr>
           <w:rFonts w:hint="eastAsia"/>
         </w:rPr>
-        <w:t xml:space="preserve">而另一类单调降至</w:t>
-      </w:r>
-      <w:r>
-        <w:t xml:space="preserve"> </w:t>
-      </w:r>
-      <w:r>
-        <w:rPr>
-          <w:rFonts w:hint="eastAsia"/>
-        </w:rPr>
-        <w:t xml:space="preserve">0.425），分散性噪声占优条件在</w:t>
+        <w:t xml:space="preserve">而</w:t>
+      </w:r>
+      <w:r>
+        <w:t xml:space="preserve"> HC </w:t>
+      </w:r>
+      <w:r>
+        <w:rPr>
+          <w:rFonts w:hint="eastAsia"/>
+        </w:rPr>
+        <w:t xml:space="preserve">类条件覆盖单调降至</w:t>
+      </w:r>
+      <w:r>
+        <w:t xml:space="preserve"> </w:t>
+      </w:r>
+      <w:r>
+        <w:rPr>
+          <w:rFonts w:hint="eastAsia"/>
+        </w:rPr>
+        <w:t xml:space="preserve">0.425——分散性噪声占优条件在</w:t>
       </w:r>
       <w:r>
         <w:t xml:space="preserve"> 9/9 </w:t>
@@ -2197,7 +2578,16 @@
         <w:rPr>
           <w:rFonts w:hint="eastAsia"/>
         </w:rPr>
-        <w:t xml:space="preserve">0.000）。BBSE</w:t>
+        <w:t xml:space="preserve">0.000）（图</w:t>
+      </w:r>
+      <w:r>
+        <w:t xml:space="preserve"> </w:t>
+      </w:r>
+      <w:r>
+        <w:rPr>
+          <w:rFonts w:hint="eastAsia"/>
+        </w:rPr>
+        <w:t xml:space="preserve">5）。BBSE</w:t>
       </w:r>
       <w:r>
         <w:t xml:space="preserve"> </w:t>
@@ -2233,7 +2623,35 @@
         <w:rPr>
           <w:rFonts w:hint="eastAsia"/>
         </w:rPr>
-        <w:t xml:space="preserve">0.000），与该方向的分数层崩塌一致。综合而言：部署覆盖表型无法由患病率重配或标签腐蚀单独复现；特征空间偏移本身是未被排除的因子（不主张因果识别），也不是患病率校正或标签清洗能独立解决的目标。</w:t>
+        <w:t xml:space="preserve">0.000）：其标签偏移假设恰在该处最不可信，故该估计作为</w:t>
+      </w:r>
+      <w:r>
+        <w:rPr>
+          <w:rFonts w:hint="eastAsia"/>
+          <w:b/>
+          <w:bCs/>
+        </w:rPr>
+        <w:t xml:space="preserve">假设违背诊断</w:t>
+      </w:r>
+      <w:r>
+        <w:rPr>
+          <w:rFonts w:hint="eastAsia"/>
+        </w:rPr>
+        <w:t xml:space="preserve">而非患病率估计报告。部署覆盖表型在该方向预设剂量下无法由患病率重配或标签腐蚀单独复现；特征空间偏移本身是</w:t>
+      </w:r>
+      <w:r>
+        <w:rPr>
+          <w:rFonts w:hint="eastAsia"/>
+          <w:b/>
+          <w:bCs/>
+        </w:rPr>
+        <w:t xml:space="preserve">一个</w:t>
+      </w:r>
+      <w:r>
+        <w:rPr>
+          <w:rFonts w:hint="eastAsia"/>
+        </w:rPr>
+        <w:t xml:space="preserve">未被排除的因子（不主张因果识别），也不是患病率校正或标签清洗能独立解决的目标。</w:t>
       </w:r>
     </w:p>
     <w:bookmarkEnd w:id="21"/>
@@ -2243,6 +2661,9 @@
         <w:pStyle w:val="Heading3"/>
       </w:pPr>
       <w:r>
+        <w:t xml:space="preserve">3.6 </w:t>
+      </w:r>
+      <w:r>
         <w:rPr>
           <w:rFonts w:hint="eastAsia"/>
         </w:rPr>
@@ -2257,7 +2678,16 @@
         <w:rPr>
           <w:rFonts w:hint="eastAsia"/>
         </w:rPr>
-        <w:t xml:space="preserve">无任何预注册敏感性分析翻转主判定：α</w:t>
+        <w:t xml:space="preserve">在预注册确证管道（单</w:t>
+      </w:r>
+      <w:r>
+        <w:t xml:space="preserve"> seed = </w:t>
+      </w:r>
+      <w:r>
+        <w:rPr>
+          <w:rFonts w:hint="eastAsia"/>
+        </w:rPr>
+        <w:t xml:space="preserve">1）下，无任何预注册敏感性分析翻转主判定：α</w:t>
       </w:r>
       <w:r>
         <w:t xml:space="preserve"> = </w:t>
@@ -2275,25 +2705,52 @@
         <w:rPr>
           <w:rFonts w:hint="eastAsia"/>
         </w:rPr>
-        <w:t xml:space="preserve">0.522–0.705）；50</w:t>
-      </w:r>
-      <w:r>
-        <w:t xml:space="preserve"> </w:t>
-      </w:r>
-      <w:r>
-        <w:rPr>
-          <w:rFonts w:hint="eastAsia"/>
-        </w:rPr>
-        <w:t xml:space="preserve">切分汇总（0.669</w:t>
-      </w:r>
-      <w:r>
-        <w:t xml:space="preserve"> ± 0.138 </w:t>
-      </w:r>
-      <w:r>
-        <w:rPr>
-          <w:rFonts w:hint="eastAsia"/>
-        </w:rPr>
-        <w:t xml:space="preserve">至</w:t>
+        <w:t xml:space="preserve">0.522–0.705）；三名单纯震颤参与者双向重纳入（最大偏移</w:t>
+      </w:r>
+      <w:r>
+        <w:t xml:space="preserve"> </w:t>
+      </w:r>
+      <w:r>
+        <w:rPr>
+          <w:rFonts w:hint="eastAsia"/>
+        </w:rPr>
+        <w:t xml:space="preserve">+0.073）；会话季度重聚合（结果逐位相同）；特征档位协变量（无单调梯度）。MIT→Tappy</w:t>
+      </w:r>
+      <w:r>
+        <w:t xml:space="preserve"> </w:t>
+      </w:r>
+      <w:r>
+        <w:rPr>
+          <w:rFonts w:hint="eastAsia"/>
+        </w:rPr>
+        <w:t xml:space="preserve">判定贴近决策边界（CI</w:t>
+      </w:r>
+      <w:r>
+        <w:t xml:space="preserve"> </w:t>
+      </w:r>
+      <w:r>
+        <w:rPr>
+          <w:rFonts w:hint="eastAsia"/>
+        </w:rPr>
+        <w:t xml:space="preserve">上界</w:t>
+      </w:r>
+      <w:r>
+        <w:t xml:space="preserve"> </w:t>
+      </w:r>
+      <w:r>
+        <w:rPr>
+          <w:rFonts w:hint="eastAsia"/>
+        </w:rPr>
+        <w:t xml:space="preserve">0.8994），其逐-seed</w:t>
+      </w:r>
+      <w:r>
+        <w:t xml:space="preserve"> </w:t>
+      </w:r>
+      <w:r>
+        <w:rPr>
+          <w:rFonts w:hint="eastAsia"/>
+        </w:rPr>
+        <w:t xml:space="preserve">切分分布（均值</w:t>
       </w:r>
       <w:r>
         <w:t xml:space="preserve"> 0.853 ± </w:t>
@@ -2302,16 +2759,43 @@
         <w:rPr>
           <w:rFonts w:hint="eastAsia"/>
         </w:rPr>
-        <w:t xml:space="preserve">0.058）；三名单纯震颤参与者双向重纳入（最大偏移</w:t>
-      </w:r>
-      <w:r>
-        <w:t xml:space="preserve"> </w:t>
-      </w:r>
-      <w:r>
-        <w:rPr>
-          <w:rFonts w:hint="eastAsia"/>
-        </w:rPr>
-        <w:t xml:space="preserve">+0.073）；会话季度重聚合（结果逐位相同）；特征档位协变量（无单调梯度）。性别分层覆盖（仅</w:t>
+        <w:t xml:space="preserve">0.058）意味着部分切分会落入证据不足带；家族级结论（跨切分平均覆盖低于</w:t>
+      </w:r>
+      <w:r>
+        <w:t xml:space="preserve"> </w:t>
+      </w:r>
+      <w:r>
+        <w:rPr>
+          <w:rFonts w:hint="eastAsia"/>
+        </w:rPr>
+        <w:t xml:space="preserve">0.90，50-seed</w:t>
+      </w:r>
+      <w:r>
+        <w:t xml:space="preserve"> </w:t>
+      </w:r>
+      <w:r>
+        <w:rPr>
+          <w:rFonts w:hint="eastAsia"/>
+        </w:rPr>
+        <w:t xml:space="preserve">对</w:t>
+      </w:r>
+      <w:r>
+        <w:t xml:space="preserve"> 0.90 </w:t>
+      </w:r>
+      <w:r>
+        <w:rPr>
+          <w:rFonts w:hint="eastAsia"/>
+        </w:rPr>
+        <w:t xml:space="preserve">的</w:t>
+      </w:r>
+      <w:r>
+        <w:t xml:space="preserve"> z ≈ </w:t>
+      </w:r>
+      <w:r>
+        <w:rPr>
+          <w:rFonts w:hint="eastAsia"/>
+        </w:rPr>
+        <w:t xml:space="preserve">5.7）与预注册功效分析见补充材料。性别分层覆盖（仅</w:t>
       </w:r>
       <w:r>
         <w:t xml:space="preserve"> Tappy </w:t>
@@ -2367,6 +2851,9 @@
         <w:pStyle w:val="Heading2"/>
       </w:pPr>
       <w:r>
+        <w:t xml:space="preserve">4. </w:t>
+      </w:r>
+      <w:r>
         <w:rPr>
           <w:rFonts w:hint="eastAsia"/>
         </w:rPr>
@@ -2404,7 +2891,7 @@
         <w:rPr>
           <w:rFonts w:hint="eastAsia"/>
         </w:rPr>
-        <w:t xml:space="preserve">的可靠性维度：它在判别力看似可接受处家族受控地失效，在判别力看似差处存活，用可接受的边际总量掩盖类条件崩塌，以差异巨大的标注成本恢复，且无法由患病率偏移与标签噪声复现。一个只报告</w:t>
+        <w:t xml:space="preserve">的可靠性维度：它在判别力看似可接受处家族受控地失效，在判别力看似差处存活，用可接受的边际总量掩盖类条件崩塌，以差异巨大的标注成本恢复，且无法由已测试的患病率与标签噪声机制复现。一个只报告</w:t>
       </w:r>
       <w:r>
         <w:t xml:space="preserve"> AUC </w:t>
@@ -2424,61 +2911,146 @@
         <w:rPr>
           <w:rFonts w:hint="eastAsia"/>
         </w:rPr>
-        <w:t xml:space="preserve">对实践。审计给出具体部署指引：(i)</w:t>
-      </w:r>
-      <w:r>
-        <w:t xml:space="preserve"> </w:t>
-      </w:r>
-      <w:r>
-        <w:rPr>
-          <w:rFonts w:hint="eastAsia"/>
-        </w:rPr>
-        <w:t xml:space="preserve">覆盖声明必须按部署目标逐一审计——库内保证不迁移；(ii)</w:t>
-      </w:r>
-      <w:r>
-        <w:t xml:space="preserve"> </w:t>
-      </w:r>
-      <w:r>
-        <w:rPr>
-          <w:rFonts w:hint="eastAsia"/>
-        </w:rPr>
-        <w:t xml:space="preserve">分数存活处修复预算小（9–18</w:t>
-      </w:r>
-      <w:r>
-        <w:t xml:space="preserve"> </w:t>
-      </w:r>
-      <w:r>
-        <w:rPr>
-          <w:rFonts w:hint="eastAsia"/>
-        </w:rPr>
-        <w:t xml:space="preserve">标注），崩塌处实际预算内无界，因此分数选择应纳入覆盖行为；(iii)</w:t>
-      </w:r>
-      <w:r>
-        <w:t xml:space="preserve"> </w:t>
-      </w:r>
-      <w:r>
-        <w:rPr>
-          <w:rFonts w:hint="eastAsia"/>
-        </w:rPr>
-        <w:t xml:space="preserve">对安全相关类别，边际总量不充分——类条件诊断为强制报告项；(iv)</w:t>
-      </w:r>
-      <w:r>
-        <w:t xml:space="preserve"> </w:t>
-      </w:r>
-      <w:r>
-        <w:rPr>
-          <w:rFonts w:hint="eastAsia"/>
-        </w:rPr>
-        <w:t xml:space="preserve">单例自动通过的工作流继承单例错误率，最差方向达</w:t>
-      </w:r>
-      <w:r>
-        <w:t xml:space="preserve"> 89% </w:t>
-      </w:r>
-      <w:r>
-        <w:rPr>
-          <w:rFonts w:hint="eastAsia"/>
-        </w:rPr>
-        <w:t xml:space="preserve">的受试者。</w:t>
+        <w:t xml:space="preserve">对实践——覆盖审计即部署治理。运营上，这些结果说明：一个部署可以通过</w:t>
+      </w:r>
+      <w:r>
+        <w:t xml:space="preserve"> AUC </w:t>
+      </w:r>
+      <w:r>
+        <w:rPr>
+          <w:rFonts w:hint="eastAsia"/>
+        </w:rPr>
+        <w:t xml:space="preserve">验收测试，却静默地把大多数阳性患者路由进自动通过路径——这就是覆盖必须进入验收门而非事后评估的原因。具体地：(i)</w:t>
+      </w:r>
+      <w:r>
+        <w:t xml:space="preserve"> </w:t>
+      </w:r>
+      <w:r>
+        <w:rPr>
+          <w:rFonts w:hint="eastAsia"/>
+        </w:rPr>
+        <w:t xml:space="preserve">将预注册判定词汇作为</w:t>
+      </w:r>
+      <w:r>
+        <w:rPr>
+          <w:rFonts w:hint="eastAsia"/>
+          <w:b/>
+          <w:bCs/>
+        </w:rPr>
+        <w:t xml:space="preserve">部署前验收门</w:t>
+      </w:r>
+      <w:r>
+        <w:rPr>
+          <w:rFonts w:hint="eastAsia"/>
+        </w:rPr>
+        <w:t xml:space="preserve">（证据不足/不相容</w:t>
+      </w:r>
+      <w:r>
+        <w:t xml:space="preserve"> = </w:t>
+      </w:r>
+      <w:r>
+        <w:rPr>
+          <w:rFonts w:hint="eastAsia"/>
+        </w:rPr>
+        <w:t xml:space="preserve">无补救证据不得签核），并安排周期性重审计，在上游设备或人群变化时触发；(ii)</w:t>
+      </w:r>
+      <w:r>
+        <w:t xml:space="preserve"> </w:t>
+      </w:r>
+      <w:r>
+        <w:rPr>
+          <w:rFonts w:hint="eastAsia"/>
+        </w:rPr>
+        <w:t xml:space="preserve">为每个部署站点预算小型、类别分层的常备校准集——本证据支持分数存活处的</w:t>
+      </w:r>
+      <w:r>
+        <w:t xml:space="preserve"> 9–18 </w:t>
+      </w:r>
+      <w:r>
+        <w:rPr>
+          <w:rFonts w:hint="eastAsia"/>
+        </w:rPr>
+        <w:t xml:space="preserve">人预算，分数崩塌处则为拒绝部署（或仅弃权型工作流）政策；(iii)</w:t>
+      </w:r>
+      <w:r>
+        <w:t xml:space="preserve"> </w:t>
+      </w:r>
+      <w:r>
+        <w:rPr>
+          <w:rFonts w:hint="eastAsia"/>
+        </w:rPr>
+        <w:t xml:space="preserve">将类条件审计结果作为允许任何自动通过工作流的</w:t>
+      </w:r>
+      <w:r>
+        <w:rPr>
+          <w:rFonts w:hint="eastAsia"/>
+          <w:b/>
+          <w:bCs/>
+        </w:rPr>
+        <w:t xml:space="preserve">门控条件</w:t>
+      </w:r>
+      <w:r>
+        <w:t xml:space="preserve">——Tappy→MIT </w:t>
+      </w:r>
+      <w:r>
+        <w:rPr>
+          <w:rFonts w:hint="eastAsia"/>
+        </w:rPr>
+        <w:t xml:space="preserve">中自动通过单例意味着</w:t>
+      </w:r>
+      <w:r>
+        <w:t xml:space="preserve"> 78.6% </w:t>
+      </w:r>
+      <w:r>
+        <w:rPr>
+          <w:rFonts w:hint="eastAsia"/>
+        </w:rPr>
+        <w:t xml:space="preserve">的</w:t>
+      </w:r>
+      <w:r>
+        <w:t xml:space="preserve"> PD </w:t>
+      </w:r>
+      <w:r>
+        <w:rPr>
+          <w:rFonts w:hint="eastAsia"/>
+        </w:rPr>
+        <w:t xml:space="preserve">患者被静默放行；在</w:t>
+      </w:r>
+      <w:r>
+        <w:t xml:space="preserve"> 1.1–1.5 </w:t>
+      </w:r>
+      <w:r>
+        <w:rPr>
+          <w:rFonts w:hint="eastAsia"/>
+        </w:rPr>
+        <w:t xml:space="preserve">的平均集合大小下，本可拦住这一失效的人工复核负载为</w:t>
+      </w:r>
+      <w:r>
+        <w:t xml:space="preserve"> 10–50% </w:t>
+      </w:r>
+      <w:r>
+        <w:rPr>
+          <w:rFonts w:hint="eastAsia"/>
+        </w:rPr>
+        <w:t xml:space="preserve">的受试者，相对失效模式是适度成本；(iv)</w:t>
+      </w:r>
+      <w:r>
+        <w:t xml:space="preserve"> </w:t>
+      </w:r>
+      <w:r>
+        <w:rPr>
+          <w:rFonts w:hint="eastAsia"/>
+        </w:rPr>
+        <w:t xml:space="preserve">将打字</w:t>
+      </w:r>
+      <w:r>
+        <w:t xml:space="preserve"> PD </w:t>
+      </w:r>
+      <w:r>
+        <w:rPr>
+          <w:rFonts w:hint="eastAsia"/>
+        </w:rPr>
+        <w:t xml:space="preserve">分诊定位为健康信息系统转诊路径的一个组件，而非独立诊断设备。</w:t>
       </w:r>
     </w:p>
     <w:p>
@@ -2563,7 +3135,7 @@
         <w:rPr>
           <w:rFonts w:hint="eastAsia"/>
         </w:rPr>
-        <w:t xml:space="preserve">结论。判别指标与覆盖保证在部署偏移下独立失效。部署打字筛查的医疗系统应将覆盖审计——边际与类条件、按目标队列——作为与判别力评估并列的常态化要求，为每个站点预算小型校准集，并优先选择覆盖行为对偏移稳健的分数函数。</w:t>
+        <w:t xml:space="preserve">结论。判别指标与覆盖保证在部署偏移下独立失效。部署打字筛查的医疗系统应将覆盖审计——边际与类条件、按目标队列——作为与判别力评估并列的常态化要求，为每个站点预算小型校准集，并将候选分数函数的覆盖行为纳入模型选择考核。</w:t>
       </w:r>
     </w:p>
     <w:bookmarkEnd w:id="24"/>
@@ -2591,7 +3163,7 @@
         <w:rPr>
           <w:rFonts w:hint="eastAsia"/>
         </w:rPr>
-        <w:t xml:space="preserve">自报目标上的估计量受自报标签限定；随机翻转非结构化错标，复现声明限于”足以复现”。(2)</w:t>
+        <w:t xml:space="preserve">自报目标上的估计量受自报标签限定；随机翻转非结构化错标，复现声明限于”足以复现”且限于一个方向的预设剂量。(2)</w:t>
       </w:r>
       <w:r>
         <w:t xml:space="preserve"> </w:t>
@@ -2636,7 +3208,7 @@
         <w:rPr>
           <w:rFonts w:hint="eastAsia"/>
         </w:rPr>
-        <w:t xml:space="preserve">个非独立方向描述性确立。(4)</w:t>
+        <w:t xml:space="preserve">个非独立方向描述性确立；两个分数证明覆盖失效非任务固有，而非分数空间的普遍规律。(4)</w:t>
       </w:r>
       <w:r>
         <w:t xml:space="preserve"> MIT </w:t>
@@ -2681,7 +3253,7 @@
         <w:rPr>
           <w:rFonts w:hint="eastAsia"/>
         </w:rPr>
-        <w:t xml:space="preserve">协变量与标签偏移并存下，类条件覆盖是测量值而非保证。(6)</w:t>
+        <w:t xml:space="preserve">库内类条件覆盖亦是测量值而非保证。(6)</w:t>
       </w:r>
       <w:r>
         <w:t xml:space="preserve"> OE </w:t>
@@ -2699,7 +3271,7 @@
         <w:rPr>
           <w:rFonts w:hint="eastAsia"/>
         </w:rPr>
-        <w:t xml:space="preserve">重复行；合并源池声明仅涉标签质量，不涉分布可交换性。(7)</w:t>
+        <w:t xml:space="preserve">重复行；合并源池声明仅涉标签质量，不涉分布可交换性，且未做留一数据源敏感性。(7)</w:t>
       </w:r>
       <w:r>
         <w:t xml:space="preserve"> Weighted CP </w:t>
@@ -2708,7 +3280,16 @@
         <w:rPr>
           <w:rFonts w:hint="eastAsia"/>
         </w:rPr>
-        <w:t xml:space="preserve">无第三方库交叉验证；正确性依赖独立</w:t>
+        <w:t xml:space="preserve">无第三方库交叉验证；p99</w:t>
+      </w:r>
+      <w:r>
+        <w:t xml:space="preserve"> </w:t>
+      </w:r>
+      <w:r>
+        <w:rPr>
+          <w:rFonts w:hint="eastAsia"/>
+        </w:rPr>
+        <w:t xml:space="preserve">截断使其形式保证失效；未截断形式的正确性依赖独立</w:t>
       </w:r>
       <w:r>
         <w:t xml:space="preserve"> </w:t>
@@ -2801,7 +3382,7 @@
         <w:rPr>
           <w:rFonts w:hint="eastAsia"/>
         </w:rPr>
-        <w:t xml:space="preserve">本研究仅使用去标识化的公开数据集（MIT-CSXPD、Tappy</w:t>
+        <w:t xml:space="preserve">本研究仅使用为研究用途发布的去标识化公开数据集（MIT-CSXPD、Tappy</w:t>
       </w:r>
       <w:r>
         <w:t xml:space="preserve"> Keplar、TyPD/i-PROGNOSIS、Online </w:t>
@@ -2810,7 +3391,7 @@
         <w:rPr>
           <w:rFonts w:hint="eastAsia"/>
         </w:rPr>
-        <w:t xml:space="preserve">English），未收集新的人体数据，无任何干预。[机构豁免声明由作者补全。]</w:t>
+        <w:t xml:space="preserve">English），未收集新的人体数据，无任何干预，故无需机构审查。[机构豁免声明由作者确认。]</w:t>
       </w:r>
       <w:r>
         <w:t xml:space="preserve"> </w:t>
@@ -2850,7 +3431,70 @@
         <w:rPr>
           <w:rFonts w:hint="eastAsia"/>
         </w:rPr>
-        <w:t xml:space="preserve">四个数据集均可从原分发方公开获取；冻结队列构建（逐步纳入/排除计数）随代码发布。</w:t>
+        <w:t xml:space="preserve">四个数据集均可从原分发方公开获取（MIT-CSXPD</w:t>
+      </w:r>
+      <w:r>
+        <w:t xml:space="preserve"> </w:t>
+      </w:r>
+      <w:r>
+        <w:rPr>
+          <w:rFonts w:hint="eastAsia"/>
+        </w:rPr>
+        <w:t xml:space="preserve">经</w:t>
+      </w:r>
+      <w:r>
+        <w:t xml:space="preserve"> neuroQWERTY </w:t>
+      </w:r>
+      <w:r>
+        <w:rPr>
+          <w:rFonts w:hint="eastAsia"/>
+        </w:rPr>
+        <w:t xml:space="preserve">发布；Tappy</w:t>
+      </w:r>
+      <w:r>
+        <w:t xml:space="preserve"> Keplar </w:t>
+      </w:r>
+      <w:r>
+        <w:rPr>
+          <w:rFonts w:hint="eastAsia"/>
+        </w:rPr>
+        <w:t xml:space="preserve">经</w:t>
+      </w:r>
+      <w:r>
+        <w:t xml:space="preserve"> Tappy/BBDP </w:t>
+      </w:r>
+      <w:r>
+        <w:rPr>
+          <w:rFonts w:hint="eastAsia"/>
+        </w:rPr>
+        <w:t xml:space="preserve">仓库，需注册；TyPD</w:t>
+      </w:r>
+      <w:r>
+        <w:t xml:space="preserve"> </w:t>
+      </w:r>
+      <w:r>
+        <w:rPr>
+          <w:rFonts w:hint="eastAsia"/>
+        </w:rPr>
+        <w:t xml:space="preserve">经</w:t>
+      </w:r>
+      <w:r>
+        <w:t xml:space="preserve"> </w:t>
+      </w:r>
+      <w:r>
+        <w:rPr>
+          <w:rFonts w:hint="eastAsia"/>
+        </w:rPr>
+        <w:t xml:space="preserve">i-PROGNOSIS；Online</w:t>
+      </w:r>
+      <w:r>
+        <w:t xml:space="preserve"> English </w:t>
+      </w:r>
+      <w:r>
+        <w:rPr>
+          <w:rFonts w:hint="eastAsia"/>
+        </w:rPr>
+        <w:t xml:space="preserve">经其发布页）；冻结队列构建（逐步纳入/排除计数）随代码发布。</w:t>
       </w:r>
       <w:r>
         <w:t xml:space="preserve"> </w:t>
@@ -2885,7 +3529,16 @@
         <w:rPr>
           <w:rFonts w:hint="eastAsia"/>
         </w:rPr>
-        <w:t xml:space="preserve">）、单元测试套件与逐格输出在项目仓库公开。</w:t>
+        <w:t xml:space="preserve">）、单元测试套件与逐格输出存档于</w:t>
+      </w:r>
+      <w:r>
+        <w:t xml:space="preserve"> [Zenodo/OSF DOI </w:t>
+      </w:r>
+      <w:r>
+        <w:rPr>
+          <w:rFonts w:hint="eastAsia"/>
+        </w:rPr>
+        <w:t xml:space="preserve">于录用时生成]；开发仓库公开。</w:t>
       </w:r>
       <w:r>
         <w:t xml:space="preserve"> </w:t>
@@ -2908,7 +3561,7 @@
         <w:rPr>
           <w:rFonts w:hint="eastAsia"/>
         </w:rPr>
-        <w:t xml:space="preserve">角色由作者分配。]</w:t>
+        <w:t xml:space="preserve">角色由作者分配：概念化、方法学、软件、研究执行、写作——待分配。]</w:t>
       </w:r>
       <w:r>
         <w:t xml:space="preserve"> </w:t>
@@ -2949,7 +3602,7 @@
         <w:rPr>
           <w:rFonts w:hint="eastAsia"/>
         </w:rPr>
-        <w:t xml:space="preserve">模型）在人工指导下用于管道执行、代码生成与内部一致性审计；作者设计研究、核验全部输出，并对包括引文在内的全部内容负责。[工具/版本/日期于提交时补全。]</w:t>
+        <w:t xml:space="preserve">模型）在人工指导下用于管道执行、代码生成与内部一致性审计；作者设计研究、核验全部输出，并对包括引文在内的全部内容负责。[工具/版本/使用日期/访问方式于提交时补全。]</w:t>
       </w:r>
     </w:p>
     <w:bookmarkEnd w:id="26"/>
@@ -3019,7 +3672,16 @@
         <w:rPr>
           <w:rFonts w:hint="eastAsia"/>
         </w:rPr>
-        <w:t xml:space="preserve">[打字动力学</w:t>
+        <w:t xml:space="preserve">[神经QWERTY</w:t>
+      </w:r>
+      <w:r>
+        <w:t xml:space="preserve"> </w:t>
+      </w:r>
+      <w:r>
+        <w:rPr>
+          <w:rFonts w:hint="eastAsia"/>
+        </w:rPr>
+        <w:t xml:space="preserve">纵向队列的打字动力学</w:t>
       </w:r>
       <w:r>
         <w:t xml:space="preserve"> PD </w:t>
@@ -3160,25 +3822,7 @@
         <w:t xml:space="preserve">团队]</w:t>
       </w:r>
       <w:r>
-        <w:t xml:space="preserve"> (2026) </w:t>
-      </w:r>
-      <w:r>
-        <w:rPr>
-          <w:rFonts w:hint="eastAsia"/>
-        </w:rPr>
-        <w:t xml:space="preserve">[多模态</w:t>
-      </w:r>
-      <w:r>
-        <w:t xml:space="preserve"> PD </w:t>
-      </w:r>
-      <w:r>
-        <w:rPr>
-          <w:rFonts w:hint="eastAsia"/>
-        </w:rPr>
-        <w:t xml:space="preserve">数字评估的共形校准与选择性拒绝].</w:t>
-      </w:r>
-      <w:r>
-        <w:t xml:space="preserve"> arXiv:2605.08302 </w:t>
+        <w:t xml:space="preserve"> (2026) SGC-RML: a reliable and interpretable longitudinal assessment for PD in real-world DNS. arXiv:2605.08302 </w:t>
       </w:r>
       <w:r>
         <w:rPr>
@@ -3223,7 +3867,7 @@
         </w:numPr>
       </w:pPr>
       <w:r>
-        <w:t xml:space="preserve">Collins GS, Moons KGM, Dhiman P, et al (2024) TRIPOD+AI statement. BMJ 385:e078378</w:t>
+        <w:t xml:space="preserve">Collins GS, Moons KGM, Dhiman P, et al (2024) TRIPOD+AI statement: updated guidance for reporting clinical prediction models that use regression or machine learning methods. BMJ 385:e078378</w:t>
       </w:r>
     </w:p>
     <w:p>
@@ -3235,7 +3879,16 @@
         </w:numPr>
       </w:pPr>
       <w:r>
-        <w:t xml:space="preserve">Luo H, et al (2025) MAPIE: a library for conformal prediction </w:t>
+        <w:t xml:space="preserve">[MAPIE </w:t>
+      </w:r>
+      <w:r>
+        <w:rPr>
+          <w:rFonts w:hint="eastAsia"/>
+        </w:rPr>
+        <w:t xml:space="preserve">维护者]</w:t>
+      </w:r>
+      <w:r>
+        <w:t xml:space="preserve"> (2025) MAPIE: a library for conformal prediction </w:t>
       </w:r>
       <w:r>
         <w:rPr>
@@ -3250,7 +3903,19 @@
         <w:rPr>
           <w:rFonts w:hint="eastAsia"/>
         </w:rPr>
-        <w:t xml:space="preserve">记录补全]</w:t>
+        <w:t xml:space="preserve">记录补全；核对作者名单]</w:t>
+      </w:r>
+    </w:p>
+    <w:p>
+      <w:pPr>
+        <w:pStyle w:val="Compact"/>
+        <w:numPr>
+          <w:ilvl w:val="0"/>
+          <w:numId w:val="1002"/>
+        </w:numPr>
+      </w:pPr>
+      <w:r>
+        <w:t xml:space="preserve">Lipton ZC, Wang Y-X, Smola A (2018) Detecting and correcting for label shift with black box predictors. In: ICML 35</w:t>
       </w:r>
     </w:p>
     <w:p>
@@ -3262,7 +3927,7 @@
     </w:p>
     <w:bookmarkEnd w:id="27"/>
     <w:bookmarkEnd w:id="28"/>
-    <w:bookmarkStart w:id="47" w:name="图投稿版将嵌入正文引用处当前为汇总预览"/>
+    <w:bookmarkStart w:id="29" w:name="表"/>
     <w:p>
       <w:pPr>
         <w:pStyle w:val="Heading1"/>
@@ -3271,7 +3936,1124 @@
         <w:rPr>
           <w:rFonts w:hint="eastAsia"/>
         </w:rPr>
-        <w:t xml:space="preserve">图（投稿版将嵌入正文引用处；当前为汇总预览）</w:t>
+        <w:t xml:space="preserve">表</w:t>
+      </w:r>
+    </w:p>
+    <w:p>
+      <w:pPr>
+        <w:pStyle w:val="FirstParagraph"/>
+      </w:pPr>
+      <w:r>
+        <w:rPr>
+          <w:rFonts w:hint="eastAsia"/>
+          <w:b/>
+          <w:bCs/>
+        </w:rPr>
+        <w:t xml:space="preserve">表</w:t>
+      </w:r>
+      <w:r>
+        <w:rPr>
+          <w:b/>
+          <w:bCs/>
+        </w:rPr>
+        <w:t xml:space="preserve"> 1.</w:t>
+      </w:r>
+      <w:r>
+        <w:t xml:space="preserve"> </w:t>
+      </w:r>
+      <w:r>
+        <w:rPr>
+          <w:rFonts w:hint="eastAsia"/>
+        </w:rPr>
+        <w:t xml:space="preserve">冻结队列构建（人；PD/HC）。</w:t>
+      </w:r>
+    </w:p>
+    <w:tbl>
+      <w:tblPr>
+        <w:tblStyle w:val="Table"/>
+        <w:tblW w:type="pct" w:w="5000"/>
+        <w:tblLayout w:type="fixed"/>
+        <w:tblLook w:firstRow="1" w:lastRow="0" w:firstColumn="0" w:lastColumn="0" w:noHBand="0" w:noVBand="0" w:val="0020"/>
+      </w:tblPr>
+      <w:tblGrid>
+        <w:gridCol w:w="1584"/>
+        <w:gridCol w:w="1584"/>
+        <w:gridCol w:w="1584"/>
+        <w:gridCol w:w="1584"/>
+        <w:gridCol w:w="1584"/>
+      </w:tblGrid>
+      <w:tr>
+        <w:trPr>
+          <w:tblHeader w:val="on"/>
+        </w:trPr>
+        <w:tc>
+          <w:tcPr/>
+          <w:p>
+            <w:pPr>
+              <w:pStyle w:val="Compact"/>
+            </w:pPr>
+            <w:r>
+              <w:rPr>
+                <w:rFonts w:hint="eastAsia"/>
+              </w:rPr>
+              <w:t xml:space="preserve">数据集</w:t>
+            </w:r>
+          </w:p>
+        </w:tc>
+        <w:tc>
+          <w:tcPr/>
+          <w:p>
+            <w:pPr>
+              <w:pStyle w:val="Compact"/>
+            </w:pPr>
+            <w:r>
+              <w:rPr>
+                <w:rFonts w:hint="eastAsia"/>
+              </w:rPr>
+              <w:t xml:space="preserve">角色</w:t>
+            </w:r>
+          </w:p>
+        </w:tc>
+        <w:tc>
+          <w:tcPr/>
+          <w:p>
+            <w:pPr>
+              <w:pStyle w:val="Compact"/>
+            </w:pPr>
+            <w:r>
+              <w:rPr>
+                <w:rFonts w:hint="eastAsia"/>
+              </w:rPr>
+              <w:t xml:space="preserve">入组</w:t>
+            </w:r>
+          </w:p>
+        </w:tc>
+        <w:tc>
+          <w:tcPr/>
+          <w:p>
+            <w:pPr>
+              <w:pStyle w:val="Compact"/>
+            </w:pPr>
+            <w:r>
+              <w:t xml:space="preserve">PD</w:t>
+            </w:r>
+          </w:p>
+        </w:tc>
+        <w:tc>
+          <w:tcPr/>
+          <w:p>
+            <w:pPr>
+              <w:pStyle w:val="Compact"/>
+            </w:pPr>
+            <w:r>
+              <w:t xml:space="preserve">HC</w:t>
+            </w:r>
+          </w:p>
+        </w:tc>
+      </w:tr>
+      <w:tr>
+        <w:tc>
+          <w:tcPr/>
+          <w:p>
+            <w:pPr>
+              <w:pStyle w:val="Compact"/>
+            </w:pPr>
+            <w:r>
+              <w:t xml:space="preserve">MIT-CSXPD</w:t>
+            </w:r>
+          </w:p>
+        </w:tc>
+        <w:tc>
+          <w:tcPr/>
+          <w:p>
+            <w:pPr>
+              <w:pStyle w:val="Compact"/>
+            </w:pPr>
+            <w:r>
+              <w:rPr>
+                <w:rFonts w:hint="eastAsia"/>
+              </w:rPr>
+              <w:t xml:space="preserve">临床金标准；方向</w:t>
+            </w:r>
+            <w:r>
+              <w:t xml:space="preserve"> 2、3 </w:t>
+            </w:r>
+            <w:r>
+              <w:rPr>
+                <w:rFonts w:hint="eastAsia"/>
+              </w:rPr>
+              <w:t xml:space="preserve">的源</w:t>
+            </w:r>
+            <w:r>
+              <w:t xml:space="preserve"> / </w:t>
+            </w:r>
+            <w:r>
+              <w:rPr>
+                <w:rFonts w:hint="eastAsia"/>
+              </w:rPr>
+              <w:t xml:space="preserve">方向</w:t>
+            </w:r>
+            <w:r>
+              <w:t xml:space="preserve"> 1 </w:t>
+            </w:r>
+            <w:r>
+              <w:rPr>
+                <w:rFonts w:hint="eastAsia"/>
+              </w:rPr>
+              <w:t xml:space="preserve">的目标</w:t>
+            </w:r>
+          </w:p>
+        </w:tc>
+        <w:tc>
+          <w:tcPr/>
+          <w:p>
+            <w:pPr>
+              <w:pStyle w:val="Compact"/>
+            </w:pPr>
+            <w:r>
+              <w:t xml:space="preserve">82</w:t>
+            </w:r>
+          </w:p>
+        </w:tc>
+        <w:tc>
+          <w:tcPr/>
+          <w:p>
+            <w:pPr>
+              <w:pStyle w:val="Compact"/>
+            </w:pPr>
+            <w:r>
+              <w:t xml:space="preserve">42</w:t>
+            </w:r>
+          </w:p>
+        </w:tc>
+        <w:tc>
+          <w:tcPr/>
+          <w:p>
+            <w:pPr>
+              <w:pStyle w:val="Compact"/>
+            </w:pPr>
+            <w:r>
+              <w:t xml:space="preserve">40</w:t>
+            </w:r>
+          </w:p>
+        </w:tc>
+      </w:tr>
+      <w:tr>
+        <w:tc>
+          <w:tcPr/>
+          <w:p>
+            <w:pPr>
+              <w:pStyle w:val="Compact"/>
+            </w:pPr>
+            <w:r>
+              <w:t xml:space="preserve">Tappy Keplar</w:t>
+            </w:r>
+          </w:p>
+        </w:tc>
+        <w:tc>
+          <w:tcPr/>
+          <w:p>
+            <w:pPr>
+              <w:pStyle w:val="Compact"/>
+            </w:pPr>
+            <w:r>
+              <w:rPr>
+                <w:rFonts w:hint="eastAsia"/>
+              </w:rPr>
+              <w:t xml:space="preserve">自报；方向</w:t>
+            </w:r>
+            <w:r>
+              <w:t xml:space="preserve"> 1 </w:t>
+            </w:r>
+            <w:r>
+              <w:rPr>
+                <w:rFonts w:hint="eastAsia"/>
+              </w:rPr>
+              <w:t xml:space="preserve">的源</w:t>
+            </w:r>
+            <w:r>
+              <w:t xml:space="preserve"> / </w:t>
+            </w:r>
+            <w:r>
+              <w:rPr>
+                <w:rFonts w:hint="eastAsia"/>
+              </w:rPr>
+              <w:t xml:space="preserve">方向</w:t>
+            </w:r>
+            <w:r>
+              <w:t xml:space="preserve"> 2 </w:t>
+            </w:r>
+            <w:r>
+              <w:rPr>
+                <w:rFonts w:hint="eastAsia"/>
+              </w:rPr>
+              <w:t xml:space="preserve">的目标</w:t>
+            </w:r>
+          </w:p>
+        </w:tc>
+        <w:tc>
+          <w:tcPr/>
+          <w:p>
+            <w:pPr>
+              <w:pStyle w:val="Compact"/>
+            </w:pPr>
+            <w:r>
+              <w:t xml:space="preserve">173</w:t>
+            </w:r>
+          </w:p>
+        </w:tc>
+        <w:tc>
+          <w:tcPr/>
+          <w:p>
+            <w:pPr>
+              <w:pStyle w:val="Compact"/>
+            </w:pPr>
+            <w:r>
+              <w:t xml:space="preserve">133</w:t>
+            </w:r>
+          </w:p>
+        </w:tc>
+        <w:tc>
+          <w:tcPr/>
+          <w:p>
+            <w:pPr>
+              <w:pStyle w:val="Compact"/>
+            </w:pPr>
+            <w:r>
+              <w:t xml:space="preserve">40</w:t>
+            </w:r>
+          </w:p>
+        </w:tc>
+      </w:tr>
+      <w:tr>
+        <w:tc>
+          <w:tcPr/>
+          <w:p>
+            <w:pPr>
+              <w:pStyle w:val="Compact"/>
+            </w:pPr>
+            <w:r>
+              <w:rPr>
+                <w:rFonts w:hint="eastAsia"/>
+              </w:rPr>
+              <w:t xml:space="preserve">TyPD（i-PROGNOSIS）</w:t>
+            </w:r>
+          </w:p>
+        </w:tc>
+        <w:tc>
+          <w:tcPr/>
+          <w:p>
+            <w:pPr>
+              <w:pStyle w:val="Compact"/>
+            </w:pPr>
+            <w:r>
+              <w:rPr>
+                <w:rFonts w:hint="eastAsia"/>
+              </w:rPr>
+              <w:t xml:space="preserve">临床；仅合并源池</w:t>
+            </w:r>
+          </w:p>
+        </w:tc>
+        <w:tc>
+          <w:tcPr/>
+          <w:p>
+            <w:pPr>
+              <w:pStyle w:val="Compact"/>
+            </w:pPr>
+            <w:r>
+              <w:t xml:space="preserve">27</w:t>
+            </w:r>
+          </w:p>
+        </w:tc>
+        <w:tc>
+          <w:tcPr/>
+          <w:p>
+            <w:pPr>
+              <w:pStyle w:val="Compact"/>
+            </w:pPr>
+            <w:r>
+              <w:t xml:space="preserve">12</w:t>
+            </w:r>
+          </w:p>
+        </w:tc>
+        <w:tc>
+          <w:tcPr/>
+          <w:p>
+            <w:pPr>
+              <w:pStyle w:val="Compact"/>
+            </w:pPr>
+            <w:r>
+              <w:t xml:space="preserve">15</w:t>
+            </w:r>
+          </w:p>
+        </w:tc>
+      </w:tr>
+      <w:tr>
+        <w:tc>
+          <w:tcPr/>
+          <w:p>
+            <w:pPr>
+              <w:pStyle w:val="Compact"/>
+            </w:pPr>
+            <w:r>
+              <w:t xml:space="preserve">Online English</w:t>
+            </w:r>
+          </w:p>
+        </w:tc>
+        <w:tc>
+          <w:tcPr/>
+          <w:p>
+            <w:pPr>
+              <w:pStyle w:val="Compact"/>
+            </w:pPr>
+            <w:r>
+              <w:rPr>
+                <w:rFonts w:hint="eastAsia"/>
+              </w:rPr>
+              <w:t xml:space="preserve">自报；仅合并目标</w:t>
+            </w:r>
+          </w:p>
+        </w:tc>
+        <w:tc>
+          <w:tcPr/>
+          <w:p>
+            <w:pPr>
+              <w:pStyle w:val="Compact"/>
+            </w:pPr>
+            <w:r>
+              <w:t xml:space="preserve">193</w:t>
+            </w:r>
+          </w:p>
+        </w:tc>
+        <w:tc>
+          <w:tcPr/>
+          <w:p>
+            <w:pPr>
+              <w:pStyle w:val="Compact"/>
+            </w:pPr>
+            <w:r>
+              <w:t xml:space="preserve">83</w:t>
+            </w:r>
+          </w:p>
+        </w:tc>
+        <w:tc>
+          <w:tcPr/>
+          <w:p>
+            <w:pPr>
+              <w:pStyle w:val="Compact"/>
+            </w:pPr>
+            <w:r>
+              <w:t xml:space="preserve">110</w:t>
+            </w:r>
+          </w:p>
+        </w:tc>
+      </w:tr>
+      <w:tr>
+        <w:tc>
+          <w:tcPr/>
+          <w:p>
+            <w:pPr>
+              <w:pStyle w:val="Compact"/>
+            </w:pPr>
+            <w:r>
+              <w:rPr>
+                <w:rFonts w:hint="eastAsia"/>
+                <w:b/>
+                <w:bCs/>
+              </w:rPr>
+              <w:t xml:space="preserve">合计</w:t>
+            </w:r>
+          </w:p>
+        </w:tc>
+        <w:tc>
+          <w:tcPr/>
+          <w:p>
+            <w:pPr>
+              <w:pStyle w:val="Compact"/>
+            </w:pPr>
+          </w:p>
+        </w:tc>
+        <w:tc>
+          <w:tcPr/>
+          <w:p>
+            <w:pPr>
+              <w:pStyle w:val="Compact"/>
+            </w:pPr>
+            <w:r>
+              <w:rPr>
+                <w:b/>
+                <w:bCs/>
+              </w:rPr>
+              <w:t xml:space="preserve">475</w:t>
+            </w:r>
+          </w:p>
+        </w:tc>
+        <w:tc>
+          <w:tcPr/>
+          <w:p>
+            <w:pPr>
+              <w:pStyle w:val="Compact"/>
+            </w:pPr>
+            <w:r>
+              <w:rPr>
+                <w:b/>
+                <w:bCs/>
+              </w:rPr>
+              <w:t xml:space="preserve">270</w:t>
+            </w:r>
+          </w:p>
+        </w:tc>
+        <w:tc>
+          <w:tcPr/>
+          <w:p>
+            <w:pPr>
+              <w:pStyle w:val="Compact"/>
+            </w:pPr>
+            <w:r>
+              <w:rPr>
+                <w:b/>
+                <w:bCs/>
+              </w:rPr>
+              <w:t xml:space="preserve">205</w:t>
+            </w:r>
+          </w:p>
+        </w:tc>
+      </w:tr>
+    </w:tbl>
+    <w:p>
+      <w:pPr>
+        <w:pStyle w:val="BodyText"/>
+      </w:pPr>
+      <w:r>
+        <w:rPr>
+          <w:rFonts w:hint="eastAsia"/>
+          <w:b/>
+          <w:bCs/>
+        </w:rPr>
+        <w:t xml:space="preserve">表</w:t>
+      </w:r>
+      <w:r>
+        <w:rPr>
+          <w:b/>
+          <w:bCs/>
+        </w:rPr>
+        <w:t xml:space="preserve"> 2.</w:t>
+      </w:r>
+      <w:r>
+        <w:t xml:space="preserve"> </w:t>
+      </w:r>
+      <w:r>
+        <w:rPr>
+          <w:rFonts w:hint="eastAsia"/>
+        </w:rPr>
+        <w:t xml:space="preserve">主终点家族（α</w:t>
+      </w:r>
+      <w:r>
+        <w:t xml:space="preserve"> = </w:t>
+      </w:r>
+      <w:r>
+        <w:rPr>
+          <w:rFonts w:hint="eastAsia"/>
+        </w:rPr>
+        <w:t xml:space="preserve">0.10，split</w:t>
+      </w:r>
+      <w:r>
+        <w:t xml:space="preserve"> </w:t>
+      </w:r>
+      <w:r>
+        <w:rPr>
+          <w:rFonts w:hint="eastAsia"/>
+        </w:rPr>
+        <w:t xml:space="preserve">CP，确证性</w:t>
+      </w:r>
+      <w:r>
+        <w:t xml:space="preserve"> seed = </w:t>
+      </w:r>
+      <w:r>
+        <w:rPr>
+          <w:rFonts w:hint="eastAsia"/>
+        </w:rPr>
+        <w:t xml:space="preserve">1）。家族wise</w:t>
+      </w:r>
+      <w:r>
+        <w:t xml:space="preserve"> Holm </w:t>
+      </w:r>
+      <w:r>
+        <w:rPr>
+          <w:rFonts w:hint="eastAsia"/>
+        </w:rPr>
+        <w:t xml:space="preserve">校正下的判定（H0：真实覆盖</w:t>
+      </w:r>
+      <w:r>
+        <w:t xml:space="preserve"> ≥ </w:t>
+      </w:r>
+      <w:r>
+        <w:rPr>
+          <w:rFonts w:hint="eastAsia"/>
+        </w:rPr>
+        <w:t xml:space="preserve">0.90）。</w:t>
+      </w:r>
+    </w:p>
+    <w:tbl>
+      <w:tblPr>
+        <w:tblStyle w:val="Table"/>
+        <w:tblW w:type="auto" w:w="0"/>
+        <w:tblLook w:firstRow="1" w:lastRow="0" w:firstColumn="0" w:lastColumn="0" w:noHBand="0" w:noVBand="0" w:val="0020"/>
+      </w:tblPr>
+      <w:tblGrid>
+        <w:gridCol w:w="1320"/>
+        <w:gridCol w:w="1320"/>
+        <w:gridCol w:w="1320"/>
+        <w:gridCol w:w="1320"/>
+        <w:gridCol w:w="1320"/>
+        <w:gridCol w:w="1320"/>
+      </w:tblGrid>
+      <w:tr>
+        <w:trPr>
+          <w:tblHeader w:val="on"/>
+        </w:trPr>
+        <w:tc>
+          <w:tcPr/>
+          <w:p>
+            <w:pPr>
+              <w:pStyle w:val="Compact"/>
+            </w:pPr>
+            <w:r>
+              <w:rPr>
+                <w:rFonts w:hint="eastAsia"/>
+              </w:rPr>
+              <w:t xml:space="preserve">方向</w:t>
+            </w:r>
+          </w:p>
+        </w:tc>
+        <w:tc>
+          <w:tcPr/>
+          <w:p>
+            <w:pPr>
+              <w:pStyle w:val="Compact"/>
+            </w:pPr>
+            <w:r>
+              <w:rPr>
+                <w:rFonts w:hint="eastAsia"/>
+              </w:rPr>
+              <w:t xml:space="preserve">模型</w:t>
+            </w:r>
+          </w:p>
+        </w:tc>
+        <w:tc>
+          <w:tcPr/>
+          <w:p>
+            <w:pPr>
+              <w:pStyle w:val="Compact"/>
+            </w:pPr>
+            <w:r>
+              <w:t xml:space="preserve">K/n</w:t>
+            </w:r>
+          </w:p>
+        </w:tc>
+        <w:tc>
+          <w:tcPr/>
+          <w:p>
+            <w:pPr>
+              <w:pStyle w:val="Compact"/>
+            </w:pPr>
+            <w:r>
+              <w:rPr>
+                <w:rFonts w:hint="eastAsia"/>
+              </w:rPr>
+              <w:t xml:space="preserve">覆盖</w:t>
+            </w:r>
+            <w:r>
+              <w:t xml:space="preserve"> [95% CI]</w:t>
+            </w:r>
+          </w:p>
+        </w:tc>
+        <w:tc>
+          <w:tcPr/>
+          <w:p>
+            <w:pPr>
+              <w:pStyle w:val="Compact"/>
+            </w:pPr>
+            <w:r>
+              <w:t xml:space="preserve">Holm q</w:t>
+            </w:r>
+          </w:p>
+        </w:tc>
+        <w:tc>
+          <w:tcPr/>
+          <w:p>
+            <w:pPr>
+              <w:pStyle w:val="Compact"/>
+            </w:pPr>
+            <w:r>
+              <w:rPr>
+                <w:rFonts w:hint="eastAsia"/>
+              </w:rPr>
+              <w:t xml:space="preserve">判定</w:t>
+            </w:r>
+          </w:p>
+        </w:tc>
+      </w:tr>
+      <w:tr>
+        <w:tc>
+          <w:tcPr/>
+          <w:p>
+            <w:pPr>
+              <w:pStyle w:val="Compact"/>
+            </w:pPr>
+            <w:r>
+              <w:t xml:space="preserve">Tappy→MIT</w:t>
+            </w:r>
+          </w:p>
+        </w:tc>
+        <w:tc>
+          <w:tcPr/>
+          <w:p>
+            <w:pPr>
+              <w:pStyle w:val="Compact"/>
+            </w:pPr>
+            <w:r>
+              <w:t xml:space="preserve">LR</w:t>
+            </w:r>
+          </w:p>
+        </w:tc>
+        <w:tc>
+          <w:tcPr/>
+          <w:p>
+            <w:pPr>
+              <w:pStyle w:val="Compact"/>
+            </w:pPr>
+            <w:r>
+              <w:t xml:space="preserve">49/82</w:t>
+            </w:r>
+          </w:p>
+        </w:tc>
+        <w:tc>
+          <w:tcPr/>
+          <w:p>
+            <w:pPr>
+              <w:pStyle w:val="Compact"/>
+            </w:pPr>
+            <w:r>
+              <w:t xml:space="preserve">0.598 [0.483, 0.704]</w:t>
+            </w:r>
+          </w:p>
+        </w:tc>
+        <w:tc>
+          <w:tcPr/>
+          <w:p>
+            <w:pPr>
+              <w:pStyle w:val="Compact"/>
+            </w:pPr>
+            <w:r>
+              <w:t xml:space="preserve">1.2×10⁻¹²</w:t>
+            </w:r>
+          </w:p>
+        </w:tc>
+        <w:tc>
+          <w:tcPr/>
+          <w:p>
+            <w:pPr>
+              <w:pStyle w:val="Compact"/>
+            </w:pPr>
+            <w:r>
+              <w:rPr>
+                <w:rFonts w:hint="eastAsia"/>
+              </w:rPr>
+              <w:t xml:space="preserve">不相容</w:t>
+            </w:r>
+          </w:p>
+        </w:tc>
+      </w:tr>
+      <w:tr>
+        <w:tc>
+          <w:tcPr/>
+          <w:p>
+            <w:pPr>
+              <w:pStyle w:val="Compact"/>
+            </w:pPr>
+            <w:r>
+              <w:t xml:space="preserve">Tappy→MIT</w:t>
+            </w:r>
+          </w:p>
+        </w:tc>
+        <w:tc>
+          <w:tcPr/>
+          <w:p>
+            <w:pPr>
+              <w:pStyle w:val="Compact"/>
+            </w:pPr>
+            <w:r>
+              <w:t xml:space="preserve">LGBM</w:t>
+            </w:r>
+          </w:p>
+        </w:tc>
+        <w:tc>
+          <w:tcPr/>
+          <w:p>
+            <w:pPr>
+              <w:pStyle w:val="Compact"/>
+            </w:pPr>
+            <w:r>
+              <w:t xml:space="preserve">79/82</w:t>
+            </w:r>
+          </w:p>
+        </w:tc>
+        <w:tc>
+          <w:tcPr/>
+          <w:p>
+            <w:pPr>
+              <w:pStyle w:val="Compact"/>
+            </w:pPr>
+            <w:r>
+              <w:t xml:space="preserve">0.963 [0.897, 0.992]</w:t>
+            </w:r>
+          </w:p>
+        </w:tc>
+        <w:tc>
+          <w:tcPr/>
+          <w:p>
+            <w:pPr>
+              <w:pStyle w:val="Compact"/>
+            </w:pPr>
+            <w:r>
+              <w:rPr>
+                <w:rFonts w:hint="eastAsia"/>
+              </w:rPr>
+              <w:t xml:space="preserve">—（对照）</w:t>
+            </w:r>
+          </w:p>
+        </w:tc>
+        <w:tc>
+          <w:tcPr/>
+          <w:p>
+            <w:pPr>
+              <w:pStyle w:val="Compact"/>
+            </w:pPr>
+            <w:r>
+              <w:t xml:space="preserve">—</w:t>
+            </w:r>
+          </w:p>
+        </w:tc>
+      </w:tr>
+      <w:tr>
+        <w:tc>
+          <w:tcPr/>
+          <w:p>
+            <w:pPr>
+              <w:pStyle w:val="Compact"/>
+            </w:pPr>
+            <w:r>
+              <w:t xml:space="preserve">MIT→Tappy</w:t>
+            </w:r>
+          </w:p>
+        </w:tc>
+        <w:tc>
+          <w:tcPr/>
+          <w:p>
+            <w:pPr>
+              <w:pStyle w:val="Compact"/>
+            </w:pPr>
+            <w:r>
+              <w:t xml:space="preserve">LR</w:t>
+            </w:r>
+          </w:p>
+        </w:tc>
+        <w:tc>
+          <w:tcPr/>
+          <w:p>
+            <w:pPr>
+              <w:pStyle w:val="Compact"/>
+            </w:pPr>
+            <w:r>
+              <w:t xml:space="preserve">147/173</w:t>
+            </w:r>
+          </w:p>
+        </w:tc>
+        <w:tc>
+          <w:tcPr/>
+          <w:p>
+            <w:pPr>
+              <w:pStyle w:val="Compact"/>
+            </w:pPr>
+            <w:r>
+              <w:t xml:space="preserve">0.850 [0.788, 0.899]</w:t>
+            </w:r>
+          </w:p>
+        </w:tc>
+        <w:tc>
+          <w:tcPr/>
+          <w:p>
+            <w:pPr>
+              <w:pStyle w:val="Compact"/>
+            </w:pPr>
+            <w:r>
+              <w:t xml:space="preserve">0.023</w:t>
+            </w:r>
+          </w:p>
+        </w:tc>
+        <w:tc>
+          <w:tcPr/>
+          <w:p>
+            <w:pPr>
+              <w:pStyle w:val="Compact"/>
+            </w:pPr>
+            <w:r>
+              <w:rPr>
+                <w:rFonts w:hint="eastAsia"/>
+              </w:rPr>
+              <w:t xml:space="preserve">不相容</w:t>
+            </w:r>
+          </w:p>
+        </w:tc>
+      </w:tr>
+      <w:tr>
+        <w:tc>
+          <w:tcPr/>
+          <w:p>
+            <w:pPr>
+              <w:pStyle w:val="Compact"/>
+            </w:pPr>
+            <w:r>
+              <w:t xml:space="preserve">MIT→Tappy</w:t>
+            </w:r>
+          </w:p>
+        </w:tc>
+        <w:tc>
+          <w:tcPr/>
+          <w:p>
+            <w:pPr>
+              <w:pStyle w:val="Compact"/>
+            </w:pPr>
+            <w:r>
+              <w:t xml:space="preserve">LGBM</w:t>
+            </w:r>
+          </w:p>
+        </w:tc>
+        <w:tc>
+          <w:tcPr/>
+          <w:p>
+            <w:pPr>
+              <w:pStyle w:val="Compact"/>
+            </w:pPr>
+            <w:r>
+              <w:t xml:space="preserve">171/173</w:t>
+            </w:r>
+          </w:p>
+        </w:tc>
+        <w:tc>
+          <w:tcPr/>
+          <w:p>
+            <w:pPr>
+              <w:pStyle w:val="Compact"/>
+            </w:pPr>
+            <w:r>
+              <w:t xml:space="preserve">0.988 [0.959, 0.999]</w:t>
+            </w:r>
+          </w:p>
+        </w:tc>
+        <w:tc>
+          <w:tcPr/>
+          <w:p>
+            <w:pPr>
+              <w:pStyle w:val="Compact"/>
+            </w:pPr>
+            <w:r>
+              <w:rPr>
+                <w:rFonts w:hint="eastAsia"/>
+              </w:rPr>
+              <w:t xml:space="preserve">—（对照）</w:t>
+            </w:r>
+          </w:p>
+        </w:tc>
+        <w:tc>
+          <w:tcPr/>
+          <w:p>
+            <w:pPr>
+              <w:pStyle w:val="Compact"/>
+            </w:pPr>
+            <w:r>
+              <w:t xml:space="preserve">—</w:t>
+            </w:r>
+          </w:p>
+        </w:tc>
+      </w:tr>
+      <w:tr>
+        <w:tc>
+          <w:tcPr/>
+          <w:p>
+            <w:pPr>
+              <w:pStyle w:val="Compact"/>
+            </w:pPr>
+            <w:r>
+              <w:rPr>
+                <w:rFonts w:hint="eastAsia"/>
+              </w:rPr>
+              <w:t xml:space="preserve">临床→自报</w:t>
+            </w:r>
+          </w:p>
+        </w:tc>
+        <w:tc>
+          <w:tcPr/>
+          <w:p>
+            <w:pPr>
+              <w:pStyle w:val="Compact"/>
+            </w:pPr>
+            <w:r>
+              <w:t xml:space="preserve">LR</w:t>
+            </w:r>
+          </w:p>
+        </w:tc>
+        <w:tc>
+          <w:tcPr/>
+          <w:p>
+            <w:pPr>
+              <w:pStyle w:val="Compact"/>
+            </w:pPr>
+            <w:r>
+              <w:t xml:space="preserve">268/366</w:t>
+            </w:r>
+          </w:p>
+        </w:tc>
+        <w:tc>
+          <w:tcPr/>
+          <w:p>
+            <w:pPr>
+              <w:pStyle w:val="Compact"/>
+            </w:pPr>
+            <w:r>
+              <w:t xml:space="preserve">0.732 [0.684, 0.777]</w:t>
+            </w:r>
+          </w:p>
+        </w:tc>
+        <w:tc>
+          <w:tcPr/>
+          <w:p>
+            <w:pPr>
+              <w:pStyle w:val="Compact"/>
+            </w:pPr>
+            <w:r>
+              <w:t xml:space="preserve">2.5×10⁻¹⁹</w:t>
+            </w:r>
+          </w:p>
+        </w:tc>
+        <w:tc>
+          <w:tcPr/>
+          <w:p>
+            <w:pPr>
+              <w:pStyle w:val="Compact"/>
+            </w:pPr>
+            <w:r>
+              <w:rPr>
+                <w:rFonts w:hint="eastAsia"/>
+              </w:rPr>
+              <w:t xml:space="preserve">不相容</w:t>
+            </w:r>
+          </w:p>
+        </w:tc>
+      </w:tr>
+      <w:tr>
+        <w:tc>
+          <w:tcPr/>
+          <w:p>
+            <w:pPr>
+              <w:pStyle w:val="Compact"/>
+            </w:pPr>
+            <w:r>
+              <w:rPr>
+                <w:rFonts w:hint="eastAsia"/>
+              </w:rPr>
+              <w:t xml:space="preserve">临床→自报</w:t>
+            </w:r>
+          </w:p>
+        </w:tc>
+        <w:tc>
+          <w:tcPr/>
+          <w:p>
+            <w:pPr>
+              <w:pStyle w:val="Compact"/>
+            </w:pPr>
+            <w:r>
+              <w:t xml:space="preserve">LGBM</w:t>
+            </w:r>
+          </w:p>
+        </w:tc>
+        <w:tc>
+          <w:tcPr/>
+          <w:p>
+            <w:pPr>
+              <w:pStyle w:val="Compact"/>
+            </w:pPr>
+            <w:r>
+              <w:t xml:space="preserve">354/366</w:t>
+            </w:r>
+          </w:p>
+        </w:tc>
+        <w:tc>
+          <w:tcPr/>
+          <w:p>
+            <w:pPr>
+              <w:pStyle w:val="Compact"/>
+            </w:pPr>
+            <w:r>
+              <w:t xml:space="preserve">0.967 [0.943, 0.983]</w:t>
+            </w:r>
+          </w:p>
+        </w:tc>
+        <w:tc>
+          <w:tcPr/>
+          <w:p>
+            <w:pPr>
+              <w:pStyle w:val="Compact"/>
+            </w:pPr>
+            <w:r>
+              <w:rPr>
+                <w:rFonts w:hint="eastAsia"/>
+              </w:rPr>
+              <w:t xml:space="preserve">—（对照）</w:t>
+            </w:r>
+          </w:p>
+        </w:tc>
+        <w:tc>
+          <w:tcPr/>
+          <w:p>
+            <w:pPr>
+              <w:pStyle w:val="Compact"/>
+            </w:pPr>
+            <w:r>
+              <w:t xml:space="preserve">—</w:t>
+            </w:r>
+          </w:p>
+        </w:tc>
+      </w:tr>
+    </w:tbl>
+    <w:p>
+      <w:r>
+        <w:pict>
+          <v:rect style="width:0;height:1.5pt" o:hralign="center" o:hrstd="t" o:hr="t"/>
+        </w:pict>
+      </w:r>
+    </w:p>
+    <w:bookmarkEnd w:id="29"/>
+    <w:bookmarkStart w:id="45" w:name="图投稿版将嵌入正文引用处当前为汇总预览与英文版-fig.15-一致"/>
+    <w:p>
+      <w:pPr>
+        <w:pStyle w:val="Heading1"/>
+      </w:pPr>
+      <w:r>
+        <w:rPr>
+          <w:rFonts w:hint="eastAsia"/>
+        </w:rPr>
+        <w:t xml:space="preserve">图（投稿版将嵌入正文引用处；当前为汇总预览，与英文版</w:t>
+      </w:r>
+      <w:r>
+        <w:t xml:space="preserve"> Fig.1–5 </w:t>
+      </w:r>
+      <w:r>
+        <w:rPr>
+          <w:rFonts w:hint="eastAsia"/>
+        </w:rPr>
+        <w:t xml:space="preserve">一致）</w:t>
       </w:r>
     </w:p>
     <w:p>
@@ -3345,18 +5127,18 @@
           <wp:inline>
             <wp:extent cx="5334000" cy="2296583"/>
             <wp:effectExtent b="0" l="0" r="0" t="0"/>
-            <wp:docPr descr="图1" title="" id="30" name="Picture"/>
+            <wp:docPr descr="图1" title="" id="31" name="Picture"/>
             <a:graphic>
               <a:graphicData uri="http://schemas.openxmlformats.org/drawingml/2006/picture">
                 <pic:pic>
                   <pic:nvPicPr>
-                    <pic:cNvPr descr="../figures/fig1_primary_forest.png" id="31" name="Picture"/>
+                    <pic:cNvPr descr="../figures/fig1_primary_forest.png" id="32" name="Picture"/>
                     <pic:cNvPicPr>
                       <a:picLocks noChangeArrowheads="1" noChangeAspect="1"/>
                     </pic:cNvPicPr>
                   </pic:nvPicPr>
                   <pic:blipFill>
-                    <a:blip r:embed="rId29"/>
+                    <a:blip r:embed="rId30"/>
                     <a:stretch>
                       <a:fillRect/>
                     </a:stretch>
@@ -3419,7 +5201,7 @@
           <w:b/>
           <w:bCs/>
         </w:rPr>
-        <w:t xml:space="preserve">类条件覆盖(安全性诊断,非分布无关保证)。</w:t>
+        <w:t xml:space="preserve">类条件覆盖(未校正的测量安全性诊断——非保证)。</w:t>
       </w:r>
       <w:r>
         <w:t xml:space="preserve"> </w:t>
@@ -3440,18 +5222,18 @@
           <wp:inline>
             <wp:extent cx="5334000" cy="2222500"/>
             <wp:effectExtent b="0" l="0" r="0" t="0"/>
-            <wp:docPr descr="图2" title="" id="33" name="Picture"/>
+            <wp:docPr descr="图2" title="" id="34" name="Picture"/>
             <a:graphic>
               <a:graphicData uri="http://schemas.openxmlformats.org/drawingml/2006/picture">
                 <pic:pic>
                   <pic:nvPicPr>
-                    <pic:cNvPr descr="../figures/fig2_class_conditional.png" id="34" name="Picture"/>
+                    <pic:cNvPr descr="../figures/fig2_class_conditional.png" id="35" name="Picture"/>
                     <pic:cNvPicPr>
                       <a:picLocks noChangeArrowheads="1" noChangeAspect="1"/>
                     </pic:cNvPicPr>
                   </pic:nvPicPr>
                   <pic:blipFill>
-                    <a:blip r:embed="rId32"/>
+                    <a:blip r:embed="rId33"/>
                     <a:stretch>
                       <a:fillRect/>
                     </a:stretch>
@@ -3506,7 +5288,7 @@
           <w:b/>
           <w:bCs/>
         </w:rPr>
-        <w:t xml:space="preserve"> 2b. 12 </w:t>
+        <w:t xml:space="preserve"> 3. </w:t>
       </w:r>
       <w:r>
         <w:rPr>
@@ -3514,7 +5296,70 @@
           <w:b/>
           <w:bCs/>
         </w:rPr>
-        <w:t xml:space="preserve">方向迁移热图(判别力侧,50-seed)。</w:t>
+        <w:t xml:space="preserve">解耦主图:ΔAUC</w:t>
+      </w:r>
+      <w:r>
+        <w:rPr>
+          <w:b/>
+          <w:bCs/>
+        </w:rPr>
+        <w:t xml:space="preserve"> vs </w:t>
+      </w:r>
+      <w:r>
+        <w:rPr>
+          <w:rFonts w:hint="eastAsia"/>
+          <w:b/>
+          <w:bCs/>
+        </w:rPr>
+        <w:t xml:space="preserve">Δ覆盖(50-seed</w:t>
+      </w:r>
+      <w:r>
+        <w:rPr>
+          <w:b/>
+          <w:bCs/>
+        </w:rPr>
+        <w:t xml:space="preserve"> </w:t>
+      </w:r>
+      <w:r>
+        <w:rPr>
+          <w:rFonts w:hint="eastAsia"/>
+          <w:b/>
+          <w:bCs/>
+        </w:rPr>
+        <w:t xml:space="preserve">均值;12</w:t>
+      </w:r>
+      <w:r>
+        <w:rPr>
+          <w:b/>
+          <w:bCs/>
+        </w:rPr>
+        <w:t xml:space="preserve"> </w:t>
+      </w:r>
+      <w:r>
+        <w:rPr>
+          <w:rFonts w:hint="eastAsia"/>
+          <w:b/>
+          <w:bCs/>
+        </w:rPr>
+        <w:t xml:space="preserve">非独立方向——描述性,不做相关性检验)。</w:t>
+      </w:r>
+      <w:r>
+        <w:t xml:space="preserve"> </w:t>
+      </w:r>
+      <w:r>
+        <w:rPr>
+          <w:rFonts w:hint="eastAsia"/>
+        </w:rPr>
+        <w:t xml:space="preserve">左=LR,右=LGBM。标签:T=Tappy,M=MIT,Y=TyPD,O=Online</w:t>
+      </w:r>
+      <w:r>
+        <w:t xml:space="preserve"> </w:t>
+      </w:r>
+      <w:r>
+        <w:rPr>
+          <w:rFonts w:hint="eastAsia"/>
+        </w:rPr>
+        <w:t xml:space="preserve">English;箭头=迁移方向。</w:t>
       </w:r>
     </w:p>
     <w:p>
@@ -3524,160 +5369,20 @@
       <w:r>
         <w:drawing>
           <wp:inline>
-            <wp:extent cx="5334000" cy="4333875"/>
+            <wp:extent cx="5334000" cy="2518833"/>
             <wp:effectExtent b="0" l="0" r="0" t="0"/>
-            <wp:docPr descr="图2b" title="" id="36" name="Picture"/>
+            <wp:docPr descr="图3" title="" id="37" name="Picture"/>
             <a:graphic>
               <a:graphicData uri="http://schemas.openxmlformats.org/drawingml/2006/picture">
                 <pic:pic>
                   <pic:nvPicPr>
-                    <pic:cNvPr descr="../figures/transfer_heatmap.png" id="37" name="Picture"/>
+                    <pic:cNvPr descr="../figures/fig3_decoupling.png" id="38" name="Picture"/>
                     <pic:cNvPicPr>
                       <a:picLocks noChangeArrowheads="1" noChangeAspect="1"/>
                     </pic:cNvPicPr>
                   </pic:nvPicPr>
                   <pic:blipFill>
-                    <a:blip r:embed="rId35"/>
-                    <a:stretch>
-                      <a:fillRect/>
-                    </a:stretch>
-                  </pic:blipFill>
-                  <pic:spPr bwMode="auto">
-                    <a:xfrm>
-                      <a:off x="0" y="0"/>
-                      <a:ext cx="5334000" cy="4333875"/>
-                    </a:xfrm>
-                    <a:prstGeom prst="rect">
-                      <a:avLst/>
-                    </a:prstGeom>
-                    <a:noFill/>
-                    <a:ln w="9525">
-                      <a:noFill/>
-                      <a:headEnd/>
-                      <a:tailEnd/>
-                    </a:ln>
-                  </pic:spPr>
-                </pic:pic>
-              </a:graphicData>
-            </a:graphic>
-          </wp:inline>
-        </w:drawing>
-      </w:r>
-    </w:p>
-    <w:p>
-      <w:pPr>
-        <w:pStyle w:val="ImageCaption"/>
-      </w:pPr>
-      <w:r>
-        <w:rPr>
-          <w:rFonts w:hint="eastAsia"/>
-        </w:rPr>
-        <w:t xml:space="preserve">图2b</w:t>
-      </w:r>
-    </w:p>
-    <w:p>
-      <w:pPr>
-        <w:pStyle w:val="BodyText"/>
-      </w:pPr>
-      <w:r>
-        <w:rPr>
-          <w:rFonts w:hint="eastAsia"/>
-          <w:b/>
-          <w:bCs/>
-        </w:rPr>
-        <w:t xml:space="preserve">图</w:t>
-      </w:r>
-      <w:r>
-        <w:rPr>
-          <w:b/>
-          <w:bCs/>
-        </w:rPr>
-        <w:t xml:space="preserve"> 3. </w:t>
-      </w:r>
-      <w:r>
-        <w:rPr>
-          <w:rFonts w:hint="eastAsia"/>
-          <w:b/>
-          <w:bCs/>
-        </w:rPr>
-        <w:t xml:space="preserve">解耦主图:ΔAUC</w:t>
-      </w:r>
-      <w:r>
-        <w:rPr>
-          <w:b/>
-          <w:bCs/>
-        </w:rPr>
-        <w:t xml:space="preserve"> vs </w:t>
-      </w:r>
-      <w:r>
-        <w:rPr>
-          <w:rFonts w:hint="eastAsia"/>
-          <w:b/>
-          <w:bCs/>
-        </w:rPr>
-        <w:t xml:space="preserve">Δ覆盖(50-seed</w:t>
-      </w:r>
-      <w:r>
-        <w:rPr>
-          <w:b/>
-          <w:bCs/>
-        </w:rPr>
-        <w:t xml:space="preserve"> </w:t>
-      </w:r>
-      <w:r>
-        <w:rPr>
-          <w:rFonts w:hint="eastAsia"/>
-          <w:b/>
-          <w:bCs/>
-        </w:rPr>
-        <w:t xml:space="preserve">均值,12</w:t>
-      </w:r>
-      <w:r>
-        <w:rPr>
-          <w:b/>
-          <w:bCs/>
-        </w:rPr>
-        <w:t xml:space="preserve"> </w:t>
-      </w:r>
-      <w:r>
-        <w:rPr>
-          <w:rFonts w:hint="eastAsia"/>
-          <w:b/>
-          <w:bCs/>
-        </w:rPr>
-        <w:t xml:space="preserve">非独立方向,描述性,不做相关性检验)。</w:t>
-      </w:r>
-      <w:r>
-        <w:t xml:space="preserve"> </w:t>
-      </w:r>
-      <w:r>
-        <w:rPr>
-          <w:rFonts w:hint="eastAsia"/>
-        </w:rPr>
-        <w:t xml:space="preserve">左=LR,右=LGBM。</w:t>
-      </w:r>
-    </w:p>
-    <w:p>
-      <w:pPr>
-        <w:pStyle w:val="CaptionedFigure"/>
-      </w:pPr>
-      <w:r>
-        <w:drawing>
-          <wp:inline>
-            <wp:extent cx="5334000" cy="2518833"/>
-            <wp:effectExtent b="0" l="0" r="0" t="0"/>
-            <wp:docPr descr="图3" title="" id="39" name="Picture"/>
-            <a:graphic>
-              <a:graphicData uri="http://schemas.openxmlformats.org/drawingml/2006/picture">
-                <pic:pic>
-                  <pic:nvPicPr>
-                    <pic:cNvPr descr="../figures/fig3_decoupling.png" id="40" name="Picture"/>
-                    <pic:cNvPicPr>
-                      <a:picLocks noChangeArrowheads="1" noChangeAspect="1"/>
-                    </pic:cNvPicPr>
-                  </pic:nvPicPr>
-                  <pic:blipFill>
-                    <a:blip r:embed="rId38"/>
+                    <a:blip r:embed="rId36"/>
                     <a:stretch>
                       <a:fillRect/>
                     </a:stretch>
@@ -3767,7 +5472,16 @@
         <w:rPr>
           <w:rFonts w:hint="eastAsia"/>
         </w:rPr>
-        <w:t xml:space="preserve">0.86–1.00)。非单调段为单次抽取抽样噪声(预声明)。</w:t>
+        <w:t xml:space="preserve">0.86–1.00):有覆盖无效用。非单调段为单次抽取抽样噪声(预声明)。audit</w:t>
+      </w:r>
+      <w:r>
+        <w:t xml:space="preserve"> </w:t>
+      </w:r>
+      <w:r>
+        <w:rPr>
+          <w:rFonts w:hint="eastAsia"/>
+        </w:rPr>
+        <w:t xml:space="preserve">0.80=预设运营审计阈值。</w:t>
       </w:r>
     </w:p>
     <w:p>
@@ -3779,18 +5493,18 @@
           <wp:inline>
             <wp:extent cx="5334000" cy="2667000"/>
             <wp:effectExtent b="0" l="0" r="0" t="0"/>
-            <wp:docPr descr="图4" title="" id="42" name="Picture"/>
+            <wp:docPr descr="图4" title="" id="40" name="Picture"/>
             <a:graphic>
               <a:graphicData uri="http://schemas.openxmlformats.org/drawingml/2006/picture">
                 <pic:pic>
                   <pic:nvPicPr>
-                    <pic:cNvPr descr="../figures/fig4_recovery_cost.png" id="43" name="Picture"/>
+                    <pic:cNvPr descr="../figures/fig4_recovery_cost.png" id="41" name="Picture"/>
                     <pic:cNvPicPr>
                       <a:picLocks noChangeArrowheads="1" noChangeAspect="1"/>
                     </pic:cNvPicPr>
                   </pic:nvPicPr>
                   <pic:blipFill>
-                    <a:blip r:embed="rId41"/>
+                    <a:blip r:embed="rId39"/>
                     <a:stretch>
                       <a:fillRect/>
                     </a:stretch>
@@ -3889,18 +5603,18 @@
           <wp:inline>
             <wp:extent cx="5334000" cy="2222500"/>
             <wp:effectExtent b="0" l="0" r="0" t="0"/>
-            <wp:docPr descr="图5" title="" id="45" name="Picture"/>
+            <wp:docPr descr="图5" title="" id="43" name="Picture"/>
             <a:graphic>
               <a:graphicData uri="http://schemas.openxmlformats.org/drawingml/2006/picture">
                 <pic:pic>
                   <pic:nvPicPr>
-                    <pic:cNvPr descr="../figures/fig5_dose_response.png" id="46" name="Picture"/>
+                    <pic:cNvPr descr="../figures/fig5_dose_response.png" id="44" name="Picture"/>
                     <pic:cNvPicPr>
                       <a:picLocks noChangeArrowheads="1" noChangeAspect="1"/>
                     </pic:cNvPicPr>
                   </pic:nvPicPr>
                   <pic:blipFill>
-                    <a:blip r:embed="rId44"/>
+                    <a:blip r:embed="rId42"/>
                     <a:stretch>
                       <a:fillRect/>
                     </a:stretch>
@@ -3938,7 +5652,7 @@
         <w:t xml:space="preserve">图5</w:t>
       </w:r>
     </w:p>
-    <w:bookmarkEnd w:id="47"/>
+    <w:bookmarkEnd w:id="45"/>
     <w:sectPr>
       <w:footnotePr>
         <w:numRestart w:val="eachSect"/>

</xml_diff>